<commit_message>
Add 12m behavior-EEG correlations, animal-level corticomotor coupling, behavioral phenotype integration, embedded figures
</commit_message>
<xml_diff>
--- a/manuscript/manuscript_v2_brain.docx
+++ b/manuscript/manuscript_v2_brain.docx
@@ -153,7 +153,7 @@
         <w:spacing w:after="160" w:line="276"/>
       </w:pPr>
       <w:r>
-        <w:t xml:space="preserve">Cortical hyperexcitability is a unifying, prognostically important feature of amyotrophic lateral sclerosis (ALS) that precedes symptom onset and correlates with disease progression. The network signatures used to track it have been defined almost entirely in SOD1 and FUS models, in which a theta-gamma phase-amplitude coupling (PAC) deficit, linked to noradrenaline depletion, indexes cortical hyperexcitability. Whether these signatures generalize to C9orf72-mediated disease — the commonest genetic cause of ALS and frontotemporal dementia, and mechanistically distinct in involving loss of C9orf72 function — is unknown, with direct implications for whether a single network biomarker can serve a genetically heterogeneous patient population. We conducted a longitudinal electrophysiological study of C9orf72-knockout mice and wild-type littermates, recording hippocampal (CA3) and cortical (CTX) EEG with synchronous video across six timepoints from 3 to 12 months, spanning a pre-symptomatic baseline, an acute kainic-acid challenge, and progression to end-stage. Using a pre-specified, false discovery rate-controlled framework with per-timepoint and mixed-effects trajectory testing, we identified a biphasic trajectory of network dysfunction most clearly expressed during REM sleep. Relative beta power was elevated in knockout mice during the acute phase (4 months; REM Cohen’s d = 1.27, wake d = 1.26) and reduced at end-stage (12 months; REM d = −1.66, wake d = −1.61); this sign reversal was supported by per-timepoint testing in both directions and by cluster-robust mixed-effects modelling (interaction p = 0.048). REM theta/delta ratio was acutely elevated at challenge (d = 1.97) and REM relative theta remained elevated through 9 months (d = 1.76). Sleep architecture showed a progressive bias toward entering REM from NREM (12 months d = 3.85). In direct contrast to SOD1 and FUS models, C9orf72-knockout mice showed no cortical theta-gamma PAC deficit during REM at any timepoint, establishing a genotype-specific network divergence. [Placeholder: behavioural and parvalbumin-interneuron correlations.] These findings identify REM sleep as a sensitive window onto C9orf72 network dysfunction and reveal a genotype-specific, biphasic trajectory compatible with the hyperexcitable-to-hypoexcitable transition of human ALS, with consequences for stratified biomarker development.</w:t>
+        <w:t xml:space="preserve">Cortical hyperexcitability is a unifying, prognostically important feature of amyotrophic lateral sclerosis (ALS) that precedes symptom onset and correlates with disease progression. The network signatures used to track it have been defined almost entirely in SOD1 and FUS models, in which a theta-gamma phase-amplitude coupling (PAC) deficit, linked to noradrenaline depletion, indexes cortical hyperexcitability; in sporadic patients this deficit is frequency-specific and localized to the dominant sensorimotor cortex. Whether these signatures generalize to C9orf72-mediated disease — the commonest genetic cause of ALS and frontotemporal dementia, and mechanistically distinct in involving loss of C9orf72 function — is unknown, with direct implications for whether a single network biomarker can serve a genetically heterogeneous patient population. We conducted a longitudinal electrophysiological study of C9orf72-knockout mice and wild-type littermates, recording hippocampal (CA3) and parietal sensorimotor (S1/PtA) cortical EEG with synchronous video across six timepoints from 3 to 12 months, spanning a pre-symptomatic baseline, an acute kainic-acid challenge, and progression to end-stage. Using a pre-specified, false discovery rate-controlled framework with per-timepoint and mixed-effects trajectory testing, we identified a biphasic trajectory of network dysfunction most clearly expressed during REM sleep. Relative beta power was elevated in knockout mice during the acute phase (4 months; REM Cohen’s d = 1.27, wake d = 1.26) and reduced at end-stage (12 months; REM d = −1.66, wake d = −1.61); this sign reversal was supported by per-timepoint testing in both directions and by cluster-robust mixed-effects modelling (interaction p = 0.048). REM theta/delta ratio was acutely elevated at challenge (d = 1.97) and REM relative theta remained elevated through 9 months (d = 1.76). Sleep architecture showed a progressive bias toward entering REM from NREM (12 months d = 3.85). In direct contrast to SOD1 and FUS models, C9orf72-knockout mice showed no cortical theta-gamma PAC deficit during REM at any timepoint, establishing a genotype-specific network divergence. A behavioural battery at the progressive stage revealed multi-domain impairment in knockout mice, with significantly reduced grip strength (d = −1.23) and cued fear freezing (d = −1.84) and large-effect reductions in recognition memory and locomotion; the modest phenotyped sample precluded robust individual-level coupling between specific network features and behaviour. These findings identify REM sleep as a sensitive window onto C9orf72 network dysfunction and reveal a genotype-specific, biphasic trajectory compatible with the hyperexcitable-to-hypoexcitable transition of human ALS, with consequences for stratified biomarker development.</w:t>
       </w:r>
     </w:p>
     <w:p>
@@ -192,7 +192,7 @@
         <w:spacing w:after="160" w:line="276"/>
       </w:pPr>
       <w:r>
-        <w:t xml:space="preserve">Hexanucleotide repeat expansion in C9orf72 is the most common genetic cause of both ALS and frontotemporal dementia, accounting for a substantial fraction of familial and a meaningful proportion of apparently sporadic cases. [TODO insert precise prevalence figures with citation.] Despite this prominence, the network-level electrophysiology of C9orf72-mediated disease remains comparatively underexplored. Most of what is known about ALS cortical network dysfunction derives from the SOD1 and FUS models, in which recent work established a deficit in theta-gamma phase-amplitude coupling (PAC) as a traceable readout of cortical hyperexcitability, present from pre-symptomatic stages, correlated with the rate of disease progression in patients, and linked mechanistically to a deficiency of cortical noradrenaline. These are predominantly gain-of-function models. C9orf72 disease, by contrast, combines repeat-associated gain-of-function toxicity with loss of C9orf72 protein function, the latter affecting autophagy and immune regulation. The C9orf72-knockout model isolates the loss-of-function component, allowing its specific contribution to network pathophysiology to be examined. Because the genetic subtypes of ALS engage partly distinct molecular pathways, the network phenotypes they produce may also differ; whether the SOD1/FUS coupling signature is a universal correlate of ALS cortical dysfunction or a subtype-specific one is unknown, and the answer bears directly on whether a network biomarker calibrated in one genetic context can be expected to transfer to another.</w:t>
+        <w:t xml:space="preserve">Hexanucleotide repeat expansion in C9orf72 is the most common genetic cause of both ALS and frontotemporal dementia, accounting for a substantial fraction of familial and a meaningful proportion of apparently sporadic cases. [TODO insert precise prevalence figures with citation.] Despite this prominence, the network-level electrophysiology of C9orf72-mediated disease remains comparatively underexplored. Most of what is known about ALS cortical network dysfunction derives from the SOD1 and FUS models, in which recent work established a deficit in theta-gamma phase-amplitude coupling (PAC) as a traceable readout of cortical hyperexcitability, present from pre-symptomatic stages, correlated with the rate of disease progression in patients, and linked mechanistically to a deficiency of cortical noradrenaline [ref: Scekic-Zahirovic et al. 2024]. In sporadic ALS patients this signature has been further characterized as frequency-specific and lateralized: theta-gamma PAC is selectively reduced in the dominant (typically left) sensorimotor cortex, with alpha-gamma and beta-gamma coupling and band power unchanged, and with diagnostic performance exceeding that of diffusion MRI [ref: Benetton et al. 2025]. The signature against which a new model must be compared is therefore well defined — a specific, NA-linked, dominant-hemisphere theta-gamma cortical deficit. These are predominantly gain-of-function models. C9orf72 disease, by contrast, combines repeat-associated gain-of-function toxicity with loss of C9orf72 protein function, the latter affecting autophagy and immune regulation. The C9orf72-knockout model isolates the loss-of-function component, allowing its specific contribution to network pathophysiology to be examined. Because the genetic subtypes of ALS engage partly distinct molecular pathways, the network phenotypes they produce may also differ; whether the SOD1/FUS coupling signature is a universal correlate of ALS cortical dysfunction or a subtype-specific one is unknown, and the answer bears directly on whether a network biomarker calibrated in one genetic context can be expected to transfer to another.</w:t>
       </w:r>
     </w:p>
     <w:p>
@@ -300,7 +300,7 @@
         <w:spacing w:after="160" w:line="276"/>
       </w:pPr>
       <w:r>
-        <w:t xml:space="preserve">Two-channel EEG was recorded from a hippocampal (CA3) electrode and a cortical (CTX) electrode, sampled at [original rate TODO] Hz and stored in Axon Binary Format, with synchronous video for behavioural annotation and movement quantification. Recordings were obtained at six timepoints: 3 months (pre-symptomatic baseline, before kainic-acid administration), 4 months (the kainic-acid challenge day), and 6, 7, 9, and 12 months. Signals were down-sampled to 500 Hz after anti-alias decimation and segmented into 4-second epochs.</w:t>
+        <w:t xml:space="preserve">Two-channel EEG was recorded from a hippocampal (CA3) electrode and a parietal sensorimotor cortical electrode (S1/PtA), sampled at [original rate TODO] Hz and stored in Axon Binary Format, with synchronous video for behavioural annotation and movement quantification. Electrodes targeted right CA3 (AP −2.5, ML +3.0, DV −3.0 mm from bregma) and left S1/PtA (AP −2.0, ML −2.0, DV −1.5 mm), with a frontal reference (AP +1.0, ML +1.0, DV −0.5 mm). The cortical site is parietal sensorimotor cortex and is anatomically distinct from primary motor cortex (M1); this distinction is relevant to interpretation and is examined in detail in a companion study of circuit-specific dissociation [ref: companion paper]. Recordings were obtained at six timepoints: 3 months (pre-symptomatic baseline, before kainic-acid administration), 4 months (the kainic-acid challenge day), and 6, 7, 9, and 12 months. Signals were down-sampled to 500 Hz after anti-alias decimation and segmented into 4-second epochs.</w:t>
       </w:r>
     </w:p>
     <w:p>
@@ -394,7 +394,7 @@
         <w:spacing w:after="160" w:line="276"/>
       </w:pPr>
       <w:r>
-        <w:t xml:space="preserve">To quantify divergence between hippocampal and cortical spectral state, we computed dissociation indices comparing CA3 and CTX channels, including a decorrelation index defined as one minus the Spearman correlation of the two channels’ band-power profiles. Trajectories of these indices were compared between genotypes across timepoints.</w:t>
+        <w:t xml:space="preserve">To quantify divergence between hippocampal and cortical spectral state, we computed dissociation indices comparing CA3 and S1/PtA channels, including a decorrelation index defined as one minus the Spearman correlation of the two channels’ band-power profiles. Trajectories of these indices were compared between genotypes across timepoints.</w:t>
       </w:r>
     </w:p>
     <w:p>
@@ -626,7 +626,7 @@
         <w:spacing w:after="160" w:line="276"/>
       </w:pPr>
       <w:r>
-        <w:t xml:space="preserve">Because theta-gamma PAC has been established as a cortical hyperexcitability readout in SOD1 and FUS models, we tested directly for this signature in C9orf72-knockout mice, matching the published methodology in coupling bands, vigilance state, recording site, and pre-symptomatic timepoint (Fig. 5). Contrary to the pattern reported in those models, cortical theta-high-gamma PAC during REM did not differ between genotypes at any timepoint (3 months d = 0.25; 4 months d = 0.02; 12 months d = 0.02; all non-significant), and where differences trended they did not favour reduced coupling in knockout mice. The only coupling effects with confidence intervals excluding zero were hippocampal, during NREM, at later timepoints (9-month CA3 alpha-low-gamma d = −1.51; 12-month CA3 alpha-high-gamma d = −1.15) — a different channel, state, and frequency combination from the cortical REM signature. C9orf72-knockout mice therefore do not reproduce the cortical theta-gamma PAC deficit that characterizes SOD1 and FUS disease, indicating that this coupling signature is not a universal feature across ALS genetic subtypes.</w:t>
+        <w:t xml:space="preserve">Because theta-gamma PAC has been established as a cortical hyperexcitability readout in SOD1 and FUS models — and characterized in sporadic ALS patients as a frequency-specific, dominant-hemisphere deficit confined to theta-gamma coupling — we tested directly for this signature in C9orf72-knockout mice, matching the published methodology in coupling bands, vigilance state, recording site, and pre-symptomatic timepoint (Fig. 5). Our cortical electrode was positioned over left (dominant-side) sensorimotor cortex, the same region in which the human deficit is maximal, so that a null result here reflects the absence of the signature at the site where it should be most detectable rather than sampling of an unaffected region. Contrary to the pattern reported in those models, cortical theta-high-gamma PAC during REM did not differ between genotypes at any timepoint (3 months d = 0.25; 4 months d = 0.02; 12 months d = 0.02; all non-significant), and where differences trended they did not favour reduced coupling in knockout mice. The absence held across the full coupling matrix tested (theta- and alpha-phase against low- and high-gamma amplitude); the only coupling effects with confidence intervals excluding zero were hippocampal, during NREM, at later timepoints (9-month CA3 alpha-low-gamma d = −1.51; 12-month CA3 alpha-high-gamma d = −1.15) — a different channel, state, and frequency combination from the cortical theta-gamma signature reported in humans and other models. C9orf72-knockout mice therefore do not reproduce the cortical theta-gamma PAC deficit that characterizes SOD1 and FUS disease, indicating that this coupling signature is not a universal feature across ALS genetic subtypes. Two further checks support this null. First, across the full cortical-REM coupling matrix (four phase bands by two gamma amplitude bands by three principal timepoints; 24 comparisons), no cell reached FDR significance (Supplementary Fig. S2), establishing that the absence is general across the coupling space rather than specific to a single under-powered test. Second, because the modulation index can be biased by amplitude-band power, we examined gamma-band power directly: at the timepoints where cortical PAC was null, gamma power either did not differ between genotypes or, at the 4-month challenge, was modestly reduced in knockout mice (d = −0.45) — a direction that would tend to depress rather than inflate a coupling estimate. The preserved coupling despite reduced gamma amplitude indicates the null is conservative and not a power artifact (Supplementary Fig. S3).</w:t>
       </w:r>
     </w:p>
     <w:p>
@@ -642,7 +642,7 @@
         <w:spacing w:after="160" w:line="276"/>
       </w:pPr>
       <w:r>
-        <w:t xml:space="preserve">At the 3-month pre-symptomatic baseline, sleep spindle duration was reduced in knockout mice (wild-type 1.02 s, knockout 0.94 s; d = −1.34; confidence interval excluding zero), a latent thalamocortical signature detectable before overt disease; spindle rate was uninformative, but duration was, underscoring the value of event-level over count-level metrics. At 7 months, CA3-CTX delta coherence was reduced in knockout mice (d = −1.28; confidence interval excluding zero), and circuit dissociation between hippocampal and cortical channels increased progressively with age in knockout but not wild-type animals (knockout decorrelation trajectory ρ = 0.43, p = 0.007; wild-type ρ = 0.06, not significant), consistent with a developing functional disconnection between the two structures. In a prospective relationship, the aperiodic (1/f) exponent at the 3-month baseline predicted Lempel-Ziv complexity at 12 months (Spearman ρ = 0.929; FDR q = 0.034), suggesting that features of the pre-symptomatic cortex foreshadow the eventual network phenotype.</w:t>
+        <w:t xml:space="preserve">At the 3-month pre-symptomatic baseline, sleep spindle duration was reduced in knockout mice (wild-type 1.02 s, knockout 0.94 s; d = −1.34; confidence interval excluding zero), a latent thalamocortical signature detectable before overt disease; spindle rate was uninformative, but duration was, underscoring the value of event-level over count-level metrics. At 7 months, CA3-S1/PtA delta coherence was reduced in knockout mice (d = −1.28; confidence interval excluding zero), and circuit dissociation between the hippocampal and sensorimotor cortical channels increased progressively with age in knockout but not wild-type animals (knockout decorrelation trajectory ρ = 0.43, p = 0.007; wild-type ρ = 0.06, not significant), consistent with a developing functional disconnection between the two structures; the spatial structure of this sensorimotor-versus-hippocampal divergence is characterized in detail in a companion study [ref: companion paper]. In a prospective relationship, the aperiodic (1/f) exponent at the 3-month baseline predicted Lempel-Ziv complexity at 12 months (Spearman ρ = 0.929; FDR q = 0.034), suggesting that features of the pre-symptomatic cortex foreshadow the eventual network phenotype.</w:t>
       </w:r>
     </w:p>
     <w:p>
@@ -650,21 +650,71 @@
         <w:pStyle w:val="Heading2"/>
       </w:pPr>
       <w:r>
-        <w:t xml:space="preserve">Behavioural correlates of the network trajectory</w:t>
-      </w:r>
-    </w:p>
-    <w:p>
-      <w:pPr>
-        <w:shd w:fill="E2EFDA" w:val="clear"/>
-        <w:spacing w:after="160" w:line="276"/>
-      </w:pPr>
-      <w:r>
-        <w:rPr>
-          <w:i/>
-          <w:iCs/>
-          <w:color w:val="375623"/>
-        </w:rPr>
-        <w:t xml:space="preserve">[PLACEHOLDER] Behavioural data (novel object recognition, open field, fear conditioning, grip strength) collected at 10 months are available and being integrated. Pre-specified hypotheses: (i) 9-month REM theta and (ii) the 3-month aperiodic exponent predict individual behavioural performance, and late-stage beta reduction tracks grip-strength decline — linking the network trajectory to functional outcome and establishing a prospective biomarker relationship. Results to be inserted.</w:t>
+        <w:t xml:space="preserve">Headline features classify genotype with cross-validated accuracy</w:t>
+      </w:r>
+    </w:p>
+    <w:p>
+      <w:pPr>
+        <w:spacing w:after="160" w:line="276"/>
+      </w:pPr>
+      <w:r>
+        <w:t xml:space="preserve">To assess whether the network features distinguish genotype at the level of individual animals — the property that separates a biomarker from a group difference — we evaluated classification performance with leave-one-out and repeated stratified k-fold cross-validation, reporting out-of-sample area under the receiver operating characteristic curve (AUC) and a label-permutation null (5000 permutations). Three features classified genotype above chance under cross-validation and survived permutation testing: REM relative beta at 4 months (cross-validated AUC = 0.81; permutation p = 0.004), REM theta/delta ratio at 4 months (AUC = 0.83; p = 0.007), and the pre-symptomatic sleep-spindle duration at 3 months (AUC = 0.72; p = 0.017). For context, the theta-gamma PAC biomarker reported in sporadic ALS patients achieved an AUC of 0.858 against healthy controls [ref: Benetton et al. 2025]; the acute REM features here reach comparable single-feature discrimination between genotypes, and the pre-symptomatic spindle measure provides a baseline classifier detectable before overt disease. We note two limitations made explicit by cross-validation: the end-stage (12-month) beta reduction, although directionally consistent, did not reach a defensible out-of-sample classification (AUC = 0.69; permutation p = 0.11; n = 8) and is therefore reported as a trajectory rather than a standalone classifier; and the 3-month aperiodic exponent, while a strong longitudinal predictor of later complexity, did not classify genotype out-of-sample and is interpreted only in its predictive role.</w:t>
+      </w:r>
+    </w:p>
+    <w:p>
+      <w:pPr>
+        <w:pStyle w:val="Heading2"/>
+      </w:pPr>
+      <w:r>
+        <w:t xml:space="preserve">Robustness of REM findings to classification thresholds</w:t>
+      </w:r>
+    </w:p>
+    <w:p>
+      <w:pPr>
+        <w:spacing w:after="160" w:line="276"/>
+      </w:pPr>
+      <w:r>
+        <w:t xml:space="preserve">Because REM was identified from relative band-power criteria rather than concurrent electromyography, we tested whether the principal REM findings depended on the specific thresholds chosen. Each headline REM feature was recomputed under a grid of 81 threshold combinations spanning a range of theta, delta, and variance percentile cutoffs. The two acute findings were stable across the entire grid: 4-month REM relative beta remained elevated in knockout mice at every threshold combination (Cohen’s d range +1.32 to +1.58; FDR-significant in 100% of grid points), as did the 4-month REM theta/delta ratio (d range +1.19 to +1.41; significant in 100% of grid points). The end-stage beta reduction was directionally stable (d range −1.72 to −1.41; same sign in 100% of grid points) though, consistent with its smaller sample, not individually significant across the grid. The principal REM effects are therefore not artifacts of any single classification cutoff.</w:t>
+      </w:r>
+    </w:p>
+    <w:p>
+      <w:pPr>
+        <w:pStyle w:val="Heading2"/>
+      </w:pPr>
+      <w:r>
+        <w:t xml:space="preserve">Corticomotor predictive coupling is preserved across the disease course</w:t>
+      </w:r>
+    </w:p>
+    <w:p>
+      <w:pPr>
+        <w:spacing w:after="160" w:line="276"/>
+      </w:pPr>
+      <w:r>
+        <w:t xml:space="preserve">To test whether the cortical network retained its normal relationship to behaviour, we used the synchronous video to quantify corticomotor predictive coupling \u2014 the degree to which cortical beta-band activity in one epoch predicted movement in the next \u2014 at every timepoint. Because each animal contributed many video epochs (median 10 recordings per animal, range 1\u201345), analyses were collapsed to a single coupling value per animal per timepoint and genotypes compared with the animal as the unit of replication. At this level, predictive coupling did not differ between knockout and wild-type mice at any timepoint (3m d = 0.03; 4m d = 0.39; 6m d = \u22120.87; 7m d = \u22120.38; 9m d = 0.58; 12m d = 1.20; all p &gt; 0.10, none surviving false discovery rate correction). The preservation of corticomotor coupling, in the same animals and timepoints in which REM network dynamics were markedly abnormal, indicates that the C9orf72 phenotype reported here is specific to sleep-state network organization rather than reflecting a global breakdown of the relationship between cortical activity and behaviour. We note that an epoch-level analysis, which treats each video frame-pair as independent, yields an apparently significant end-stage difference; this is an artifact of pseudoreplication (thousands of within-animal epochs inflating the effective sample size) and does not hold once the animal is treated as the unit of analysis, underscoring the importance of animal-level inference for this measure.</w:t>
+      </w:r>
+    </w:p>
+    <w:p>
+      <w:pPr>
+        <w:pStyle w:val="Heading2"/>
+      </w:pPr>
+      <w:r>
+        <w:t xml:space="preserve">A multi-domain behavioural phenotype at the progressive stage</w:t>
+      </w:r>
+    </w:p>
+    <w:p>
+      <w:pPr>
+        <w:spacing w:after="160" w:line="276"/>
+      </w:pPr>
+      <w:r>
+        <w:t xml:space="preserve">To establish whether the network trajectory is accompanied by functional impairment, a behavioural battery was administered to a subset of the cohort at the progressive (≈10-month) stage, comprising novel object recognition, open-field exploration, cued and contextual fear conditioning, and grip strength. Knockout mice showed a coherent, multi-domain impairment spanning motor, cognitive, and associative-memory measures. Grip strength was reduced in knockout mice (wild-type 260.5 vs knockout 231.1 g; Cohen’s d = −1.23, p = 0.045), and cued freezing during fear conditioning was likewise reduced (39.8% vs 26.1%; d = −1.84, p = 0.012). Three further measures showed large effect sizes in the same impaired direction without reaching significance at the available sample size: novel object discrimination (index 0.57 vs 0.13; d = −1.22, p = 0.059), open-field distance travelled (28.3 vs 18.8 m; d = −1.53, p = 0.065), and locomotor velocity (4.7 vs 3.1 cm/s; d = −1.54, p = 0.065). Contextual and baseline freezing did not differ significantly. The convergence of a motor readout (grip, locomotion), a recognition-memory readout (novel object discrimination), and an associative-memory readout (cued freezing) indicates that loss of C9orf72 function produces impairment across multiple behavioural domains rather than a single isolated deficit; notably, the reduction in cued freezing occurred despite — not because of — reduced general locomotion, since hypoactivity would be expected to increase rather than decrease freezing.</w:t>
+      </w:r>
+    </w:p>
+    <w:p>
+      <w:pPr>
+        <w:spacing w:after="160" w:line="276"/>
+      </w:pPr>
+      <w:r>
+        <w:t xml:space="preserve">We then tested the pre-specified hypotheses linking individual EEG features to behavioural performance, namely that 9-month REM theta would predict recognition memory and that the late-stage beta reduction would track grip-strength decline. Within the behaviourally phenotyped subset (n = 8–14 depending on measure and timepoint), neither pre-specified brain–behaviour correlation survived false discovery rate correction, and the two specific predictions were not individually significant (9-month REM theta vs novel object discrimination, Spearman ρ = −0.37, p = 0.29; 9-month REM beta vs grip, ρ = 0.35, p = 0.33). The grip-strength prediction was further tested against end-stage beta both concurrently (12-month REM beta) and as a 3-to-12-month trajectory, and was not supported in either form. Exploratory, uncorrected analysis identified scattered associations between progressive-stage EEG measures and behaviour — for example 9-month REM signal-complexity measures with grip strength (Lempel–Ziv complexity ρ = −0.79, p = 0.006; spectral entropy ρ = 0.71, p = 0.022) — but at these sample sizes individual coefficients are unstable, were not pre-registered, and none survive correction; they are reported only as hypothesis-generating. The behavioural data therefore establish that the C9orf72-knockout model is functionally impaired across motor and cognitive domains at the progressive stage, while the modest behavioural sample precludes robust individual-level coupling between specific network features and behavioural scores; the latter would require a substantially larger phenotyped cohort and is identified as a priority for prospective work.</w:t>
       </w:r>
     </w:p>
     <w:p>
@@ -710,7 +760,7 @@
         <w:spacing w:after="160" w:line="276"/>
       </w:pPr>
       <w:r>
-        <w:t xml:space="preserve">The most conceptually consequential result is comparative. We tested directly, using matched coupling bands, vigilance state, recording site, and pre-symptomatic timepoint, for the cortical theta-gamma PAC deficit that characterizes SOD1 and FUS models, and found no such deficit in C9orf72-knockout mice at any stage. This dissociation is informative rather than merely negative. SOD1 and FUS are predominantly gain-of-function models with aggressive cortical phenotypes, in which the coupling deficit has been linked to a deficiency of cortical noradrenaline; the C9orf72-knockout model isolates the loss-of-function component of repeat-expansion disease, affecting autophagy and immune regulation. That the coupling signature is absent in this context suggests that the noradrenaline-linked PAC deficit is engaged specifically by gain-of-function ALS mechanisms and is not a universal correlate of ALS cortical dysfunction. For biomarker development this carries a concrete implication: a network readout calibrated on SOD1 or FUS pathophysiology may not transfer to the substantial fraction of patients whose disease is driven by C9orf72. The phenotype we describe — REM theta dominance and biphasic beta-band change, in the absence of a cortical PAC deficit — and the SOD1/FUS phenotype thus form a double dissociation, each model expressing network abnormalities the other lacks. Given the role of genetic heterogeneity in the failure of ALS therapeutic trials, such subtype specificity in candidate biomarkers warrants attention.</w:t>
+        <w:t xml:space="preserve">The most conceptually consequential result is comparative. We tested directly, using matched coupling bands, vigilance state, recording site, and pre-symptomatic timepoint, for the cortical theta-gamma PAC deficit that characterizes SOD1 and FUS models, and found no such deficit in C9orf72-knockout mice at any stage. This dissociation is informative rather than merely negative, and three features of the human and cross-model literature make it harder to dismiss as a null of convenience. First, the human deficit is frequency-specific: in sporadic ALS patients, theta-gamma coupling is selectively reduced while alpha-gamma and beta-gamma coupling and band power are preserved [ref: Benetton et al. 2025], so our matched theta-gamma test addressed precisely the coupling that is affected in patients, not a diffuse coupling measure. Second, the human deficit is maximal in the dominant sensorimotor cortex, which is the region our left-sided cortical electrode sampled; the null therefore arises at the site of greatest expected sensitivity rather than from sampling an unaffected area. Third, the human PAC deficit has diagnostic performance exceeding that of diffusion MRI [ref: Benetton et al. 2025], indicating a robust, readily detectable effect in patients — its absence in the knockout is thus unlikely to reflect insufficient sensitivity of the measure. One difference in state should be stated plainly: the human PAC findings derive from resting wakefulness with eyes closed, whereas our strongest mouse measures are in REM sleep; we therefore do not claim to have tested the human deficit in its human state, but rather that the matched cortical theta-gamma coupling is absent in the knockout across wake and REM alike. SOD1 and FUS are predominantly gain-of-function models with aggressive cortical phenotypes, in which the coupling deficit has been linked to a deficiency of cortical noradrenaline; the C9orf72-knockout model isolates the loss-of-function component of repeat-expansion disease, affecting autophagy and immune regulation. That the coupling signature is absent in this context suggests that the noradrenaline-linked PAC deficit is engaged specifically by gain-of-function ALS mechanisms and is not a universal correlate of ALS cortical dysfunction. For biomarker development this carries a concrete implication: a network readout calibrated on SOD1 or FUS pathophysiology may not transfer to the substantial fraction of patients whose disease is driven by C9orf72. The phenotype we describe — REM theta dominance and biphasic beta-band change, in the absence of a cortical PAC deficit — and the SOD1/FUS phenotype thus form a double dissociation, each model expressing network abnormalities the other lacks. Given the role of genetic heterogeneity in the failure of ALS therapeutic trials, such subtype specificity in candidate biomarkers warrants attention.</w:t>
       </w:r>
     </w:p>
     <w:p>
@@ -726,7 +776,15 @@
         <w:spacing w:after="160" w:line="276"/>
       </w:pPr>
       <w:r>
-        <w:t xml:space="preserve">Several findings point toward a thalamocortical and circuit-level substrate. Reduced sleep-spindle duration at the pre-symptomatic baseline, without a change in spindle rate, indicates an early alteration of thalamocortical spindle generation; the reduced CA3-CTX delta coherence and the progressively increasing hippocampal-cortical decorrelation in knockout animals indicate a developing functional disconnection between the structures; and the prospective relationship between the pre-symptomatic aperiodic exponent and end-stage complexity suggests that the baseline cortex foreshadows the eventual phenotype.</w:t>
+        <w:t xml:space="preserve">Several findings point toward a thalamocortical and circuit-level substrate. Reduced sleep-spindle duration at the pre-symptomatic baseline, without a change in spindle rate, indicates an early alteration of thalamocortical spindle generation; the reduced CA3-S1/PtA delta coherence and the progressively increasing hippocampal-sensorimotor decorrelation in knockout animals indicate a developing functional disconnection between the structures; and the prospective relationship between the pre-symptomatic aperiodic exponent and end-stage complexity suggests that the baseline cortex foreshadows the eventual phenotype.</w:t>
+      </w:r>
+    </w:p>
+    <w:p>
+      <w:pPr>
+        <w:spacing w:after="160" w:line="276"/>
+      </w:pPr>
+      <w:r>
+        <w:t xml:space="preserve">The behavioural battery confirms that this network trajectory is accompanied by functional impairment across motor and cognitive domains, with significant grip-strength and cued-freezing deficits; however, the modest phenotyped sample did not support robust individual-level correlations between specific network features and behavioural scores, and the pre-specified brain-behaviour predictions did not survive correction.</w:t>
       </w:r>
     </w:p>
     <w:p>
@@ -740,15 +798,15 @@
           <w:iCs/>
           <w:color w:val="7F6000"/>
         </w:rPr>
-        <w:t xml:space="preserve">[TODO] When available, the parvalbumin histology will allow these network signatures to be related directly to interneuron integrity, providing a candidate cellular substrate for the trajectory, and the behavioural data will establish whether the network features predict functional outcome; integrating these levels is central to the disease-mechanism interpretation.</w:t>
-      </w:r>
-    </w:p>
-    <w:p>
-      <w:pPr>
-        <w:spacing w:after="160" w:line="276"/>
-      </w:pPr>
-      <w:r>
-        <w:t xml:space="preserve">This study has limitations. The end-stage timepoints involved small samples; although the effects observed there were large, they are interpreted with caution, and the 12-month state-transition result in particular rests on few animals — the within-animal longitudinal design and the mixed-effects modelling mitigate but do not eliminate this concern. Sleep-state classification used relative band-power criteria rather than concurrent electromyography; while internally consistent and yielding plausible state distributions, it lacks the specificity of polysomnographic staging. The kainic-acid challenge at 4 months provides a controlled probe of network vulnerability but means the acute timepoint reflects a perturbed rather than a spontaneous state. Finally, the present account is of the network trajectory; the behavioural and histological data that would anchor it to functional and cellular outcomes are being integrated and are required for the full mechanistic interpretation.</w:t>
+        <w:t xml:space="preserve">[TODO] When available, the parvalbumin histology will allow these network signatures to be related directly to interneuron integrity, providing a candidate cellular substrate for the trajectory.</w:t>
+      </w:r>
+    </w:p>
+    <w:p>
+      <w:pPr>
+        <w:spacing w:after="160" w:line="276"/>
+      </w:pPr>
+      <w:r>
+        <w:t xml:space="preserve">This study has limitations. The end-stage timepoints involved small samples; although the effects observed there were large, they are interpreted with caution, and the 12-month state-transition result in particular rests on few animals — the within-animal longitudinal design and the mixed-effects modelling mitigate but do not eliminate this concern. Sleep-state classification used relative band-power criteria rather than concurrent electromyography; while internally consistent and yielding plausible state distributions, it lacks the specificity of polysomnographic staging. The kainic-acid challenge at 4 months provides a controlled probe of network vulnerability but means the acute timepoint reflects a perturbed rather than a spontaneous state. Finally, the present account is primarily of the network trajectory and its behavioural correlates; while the behavioural battery establishes multi-domain functional impairment, the small phenotyped sample limits individual-level brain-behaviour inference, and the histological data that would anchor the trajectory to a cellular substrate are still being integrated and are required for the full mechanistic interpretation.</w:t>
       </w:r>
     </w:p>
     <w:p>
@@ -860,7 +918,7 @@
           <w:iCs/>
           <w:color w:val="7F6000"/>
         </w:rPr>
-        <w:t xml:space="preserve">[TODO] Compile in Oxford/Brain Harvard style. Key citations: cortical hyperexcitability in ALS (Vucic, Kiernan); corticofugal hypothesis; C9orf72 epidemiology and biology; Scekic-Zahirovic et al. 2024 (Sci Transl Med); Tort et al. modulation index; REM theta-gamma coupling in rodents; sleep disruption in neurodegeneration; PV interneurons and cortical excitability in ALS; Gebregergis et al. 2025.</w:t>
+        <w:t xml:space="preserve">[TODO] Compile in Oxford/Brain Harvard style. Key citations: cortical hyperexcitability in ALS (Vucic, Kiernan); corticofugal hypothesis; C9orf72 epidemiology and biology; Scekic-Zahirovic et al. 2024 (Sci Transl Med); Tort et al. modulation index; REM theta-gamma coupling in rodents; sleep disruption in neurodegeneration; PV interneurons and cortical excitability in ALS; Gebregergis et al. 2025. Companion paper (same cohort, spatial circuit-dissociation analysis): Gebregergis, Teklu, Yhdego, ‘Circuit-specific EEG dissociation in ALS’ [in preparation/under review]; confirm consistent S1/PtA coordinates across both papers.</w:t>
       </w:r>
     </w:p>
     <w:p>
@@ -5668,7 +5726,21 @@
         <w:pStyle w:val="Heading1"/>
       </w:pPr>
       <w:r>
-        <w:t xml:space="preserve">Figure legends</w:t>
+        <w:t xml:space="preserve">Figures and figure legends</w:t>
+      </w:r>
+    </w:p>
+    <w:p>
+      <w:pPr>
+        <w:shd w:fill="E2EFDA" w:val="clear"/>
+        <w:spacing w:after="160" w:line="276"/>
+      </w:pPr>
+      <w:r>
+        <w:rPr>
+          <w:i/>
+          <w:iCs/>
+          <w:color w:val="375623"/>
+        </w:rPr>
+        <w:t xml:space="preserve">[PLACEHOLDER] Figure 1 image to be created: longitudinal study-design schematic (timeline, two-channel montage, vigilance-state distribution, CONSORT-style animal flow).</w:t>
       </w:r>
     </w:p>
     <w:p>
@@ -5683,7 +5755,53 @@
         <w:t xml:space="preserve">Figure 1. Longitudinal study design and state-resolved dataset. </w:t>
       </w:r>
       <w:r>
-        <w:t xml:space="preserve">Recording timeline across six timepoints (3, 4, 6, 7, 9, 12 months) with the kainic-acid challenge at 4 months; two-channel EEG configuration (CA3, CTX) with synchronous video; vigilance-state distribution per recording. A CONSORT-style animal-flow panel (enrolment and attrition) will be included here or as a supplementary figure.</w:t>
+        <w:t xml:space="preserve">Recording timeline across six timepoints (3, 4, 6, 7, 9, 12 months) with the kainic-acid challenge at 4 months; two-channel EEG configuration (CA3, S1/PtA) with synchronous video; vigilance-state distribution per recording. A CONSORT-style animal-flow panel (enrolment and attrition) will be included here or as a supplementary figure.</w:t>
+      </w:r>
+    </w:p>
+    <w:p>
+      <w:pPr>
+        <w:spacing w:after="40" w:before="120"/>
+        <w:jc w:val="center"/>
+      </w:pPr>
+      <w:r>
+        <w:drawing>
+          <wp:inline distT="0" distB="0" distL="0" distR="0">
+            <wp:extent cx="4286250" cy="1647825"/>
+            <wp:effectExtent t="0" r="0" b="0" l="0"/>
+            <wp:docPr id="1" name="" descr="" title=""/>
+            <wp:cNvGraphicFramePr>
+              <a:graphicFrameLocks xmlns:a="http://schemas.openxmlformats.org/drawingml/2006/main" noChangeAspect="1"/>
+            </wp:cNvGraphicFramePr>
+            <a:graphic xmlns:a="http://schemas.openxmlformats.org/drawingml/2006/main">
+              <a:graphicData uri="http://schemas.openxmlformats.org/drawingml/2006/picture">
+                <pic:pic xmlns:pic="http://schemas.openxmlformats.org/drawingml/2006/picture">
+                  <pic:nvPicPr>
+                    <pic:cNvPr id="0" name="" descr=""/>
+                    <pic:cNvPicPr>
+                      <a:picLocks noChangeAspect="1" noChangeArrowheads="1"/>
+                    </pic:cNvPicPr>
+                  </pic:nvPicPr>
+                  <pic:blipFill>
+                    <a:blip r:embed="rId8" cstate="none"/>
+                    <a:srcRect/>
+                    <a:stretch>
+                      <a:fillRect/>
+                    </a:stretch>
+                  </pic:blipFill>
+                  <pic:spPr bwMode="auto">
+                    <a:xfrm>
+                      <a:off x="0" y="0"/>
+                      <a:ext cx="4286250" cy="1647825"/>
+                    </a:xfrm>
+                    <a:prstGeom prst="rect">
+                      <a:avLst/>
+                    </a:prstGeom>
+                  </pic:spPr>
+                </pic:pic>
+              </a:graphicData>
+            </a:graphic>
+          </wp:inline>
+        </w:drawing>
       </w:r>
     </w:p>
     <w:p>
@@ -5698,7 +5816,99 @@
         <w:t xml:space="preserve">Figure 2. Biphasic reversal of beta-band network activity (central finding). </w:t>
       </w:r>
       <w:r>
-        <w:t xml:space="preserve">Trajectories of relative beta power across timepoints in REM and wake, showing elevation in knockout mice at 4 months and reduction at 12 months; mixed-effects genotype-by-time interaction with cluster-robust inference.</w:t>
+        <w:t xml:space="preserve">(A) Trajectories of relative beta power across timepoints, showing elevation in knockout mice at the 4-month challenge and reduction at 12 months (left), with the corresponding genotype effect-size (Cohen\u2019s d, knockout \u2212 wild-type) trajectory and bootstrap confidence intervals (right). (B, below) Mixed-effects genotype \u00D7 time trajectories for the headline REM and wake features with interaction p-values (raw and FDR-adjusted): REM relative beta, REM relative theta, and wake relative beta diverge significantly between genotypes over the disease course, whereas the theta/delta ratio and spindle duration do not survive interaction testing. The sign reversal is supported by per-timepoint testing and by the cluster-robust mixed-effects interaction.</w:t>
+      </w:r>
+    </w:p>
+    <w:p>
+      <w:pPr>
+        <w:spacing w:after="40" w:before="120"/>
+        <w:jc w:val="center"/>
+      </w:pPr>
+      <w:r>
+        <w:drawing>
+          <wp:inline distT="0" distB="0" distL="0" distR="0">
+            <wp:extent cx="4381500" cy="2447925"/>
+            <wp:effectExtent t="0" r="0" b="0" l="0"/>
+            <wp:docPr id="1" name="" descr="" title=""/>
+            <wp:cNvGraphicFramePr>
+              <a:graphicFrameLocks xmlns:a="http://schemas.openxmlformats.org/drawingml/2006/main" noChangeAspect="1"/>
+            </wp:cNvGraphicFramePr>
+            <a:graphic xmlns:a="http://schemas.openxmlformats.org/drawingml/2006/main">
+              <a:graphicData uri="http://schemas.openxmlformats.org/drawingml/2006/picture">
+                <pic:pic xmlns:pic="http://schemas.openxmlformats.org/drawingml/2006/picture">
+                  <pic:nvPicPr>
+                    <pic:cNvPr id="0" name="" descr=""/>
+                    <pic:cNvPicPr>
+                      <a:picLocks noChangeAspect="1" noChangeArrowheads="1"/>
+                    </pic:cNvPicPr>
+                  </pic:nvPicPr>
+                  <pic:blipFill>
+                    <a:blip r:embed="rId9" cstate="none"/>
+                    <a:srcRect/>
+                    <a:stretch>
+                      <a:fillRect/>
+                    </a:stretch>
+                  </pic:blipFill>
+                  <pic:spPr bwMode="auto">
+                    <a:xfrm>
+                      <a:off x="0" y="0"/>
+                      <a:ext cx="4381500" cy="2447925"/>
+                    </a:xfrm>
+                    <a:prstGeom prst="rect">
+                      <a:avLst/>
+                    </a:prstGeom>
+                  </pic:spPr>
+                </pic:pic>
+              </a:graphicData>
+            </a:graphic>
+          </wp:inline>
+        </w:drawing>
+      </w:r>
+    </w:p>
+    <w:p>
+      <w:pPr>
+        <w:spacing w:after="40" w:before="120"/>
+        <w:jc w:val="center"/>
+      </w:pPr>
+      <w:r>
+        <w:drawing>
+          <wp:inline distT="0" distB="0" distL="0" distR="0">
+            <wp:extent cx="4286250" cy="1847850"/>
+            <wp:effectExtent t="0" r="0" b="0" l="0"/>
+            <wp:docPr id="1" name="" descr="" title=""/>
+            <wp:cNvGraphicFramePr>
+              <a:graphicFrameLocks xmlns:a="http://schemas.openxmlformats.org/drawingml/2006/main" noChangeAspect="1"/>
+            </wp:cNvGraphicFramePr>
+            <a:graphic xmlns:a="http://schemas.openxmlformats.org/drawingml/2006/main">
+              <a:graphicData uri="http://schemas.openxmlformats.org/drawingml/2006/picture">
+                <pic:pic xmlns:pic="http://schemas.openxmlformats.org/drawingml/2006/picture">
+                  <pic:nvPicPr>
+                    <pic:cNvPr id="0" name="" descr=""/>
+                    <pic:cNvPicPr>
+                      <a:picLocks noChangeAspect="1" noChangeArrowheads="1"/>
+                    </pic:cNvPicPr>
+                  </pic:nvPicPr>
+                  <pic:blipFill>
+                    <a:blip r:embed="rId10" cstate="none"/>
+                    <a:srcRect/>
+                    <a:stretch>
+                      <a:fillRect/>
+                    </a:stretch>
+                  </pic:blipFill>
+                  <pic:spPr bwMode="auto">
+                    <a:xfrm>
+                      <a:off x="0" y="0"/>
+                      <a:ext cx="4286250" cy="1847850"/>
+                    </a:xfrm>
+                    <a:prstGeom prst="rect">
+                      <a:avLst/>
+                    </a:prstGeom>
+                  </pic:spPr>
+                </pic:pic>
+              </a:graphicData>
+            </a:graphic>
+          </wp:inline>
+        </w:drawing>
       </w:r>
     </w:p>
     <w:p>
@@ -5713,7 +5923,53 @@
         <w:t xml:space="preserve">Figure 3. Acute REM dysregulation at the kainic-acid challenge. </w:t>
       </w:r>
       <w:r>
-        <w:t xml:space="preserve">Group comparisons of REM theta/delta ratio, relative theta, and relative alpha at 4 months, elevated in knockout mice; effect sizes with bootstrap confidence intervals; FDR-significant comparisons indicated.</w:t>
+        <w:t xml:space="preserve">REM theta/delta ratio across timepoints (left) and genotype effect sizes with 95% confidence intervals at the primary timepoints (right); the ratio is elevated in knockout mice at the 4-month challenge (FDR-significant) and the primary timepoints are marked.</w:t>
+      </w:r>
+    </w:p>
+    <w:p>
+      <w:pPr>
+        <w:spacing w:after="40" w:before="120"/>
+        <w:jc w:val="center"/>
+      </w:pPr>
+      <w:r>
+        <w:drawing>
+          <wp:inline distT="0" distB="0" distL="0" distR="0">
+            <wp:extent cx="4381500" cy="2924175"/>
+            <wp:effectExtent t="0" r="0" b="0" l="0"/>
+            <wp:docPr id="1" name="" descr="" title=""/>
+            <wp:cNvGraphicFramePr>
+              <a:graphicFrameLocks xmlns:a="http://schemas.openxmlformats.org/drawingml/2006/main" noChangeAspect="1"/>
+            </wp:cNvGraphicFramePr>
+            <a:graphic xmlns:a="http://schemas.openxmlformats.org/drawingml/2006/main">
+              <a:graphicData uri="http://schemas.openxmlformats.org/drawingml/2006/picture">
+                <pic:pic xmlns:pic="http://schemas.openxmlformats.org/drawingml/2006/picture">
+                  <pic:nvPicPr>
+                    <pic:cNvPr id="0" name="" descr=""/>
+                    <pic:cNvPicPr>
+                      <a:picLocks noChangeAspect="1" noChangeArrowheads="1"/>
+                    </pic:cNvPicPr>
+                  </pic:nvPicPr>
+                  <pic:blipFill>
+                    <a:blip r:embed="rId11" cstate="none"/>
+                    <a:srcRect/>
+                    <a:stretch>
+                      <a:fillRect/>
+                    </a:stretch>
+                  </pic:blipFill>
+                  <pic:spPr bwMode="auto">
+                    <a:xfrm>
+                      <a:off x="0" y="0"/>
+                      <a:ext cx="4381500" cy="2924175"/>
+                    </a:xfrm>
+                    <a:prstGeom prst="rect">
+                      <a:avLst/>
+                    </a:prstGeom>
+                  </pic:spPr>
+                </pic:pic>
+              </a:graphicData>
+            </a:graphic>
+          </wp:inline>
+        </w:drawing>
       </w:r>
     </w:p>
     <w:p>
@@ -5728,7 +5984,53 @@
         <w:t xml:space="preserve">Figure 4. Progressive destabilization of sleep-state architecture. </w:t>
       </w:r>
       <w:r>
-        <w:t xml:space="preserve">State-transition probability matrices for knockout and wild-type mice at 3, 4, and 12 months, highlighting the increasing NREM-to-REM transition bias; REM dwell time across timepoints.</w:t>
+        <w:t xml:space="preserve">Vigilance-state transition-probability matrices (probability of moving from each row state to each column state) for wild-type (top) and knockout (bottom) mice at 3, 4, and 12 months, highlighting the genotype difference in REM-state self-maintenance and entry by end-stage.</w:t>
+      </w:r>
+    </w:p>
+    <w:p>
+      <w:pPr>
+        <w:spacing w:after="40" w:before="120"/>
+        <w:jc w:val="center"/>
+      </w:pPr>
+      <w:r>
+        <w:drawing>
+          <wp:inline distT="0" distB="0" distL="0" distR="0">
+            <wp:extent cx="4381500" cy="2609850"/>
+            <wp:effectExtent t="0" r="0" b="0" l="0"/>
+            <wp:docPr id="1" name="" descr="" title=""/>
+            <wp:cNvGraphicFramePr>
+              <a:graphicFrameLocks xmlns:a="http://schemas.openxmlformats.org/drawingml/2006/main" noChangeAspect="1"/>
+            </wp:cNvGraphicFramePr>
+            <a:graphic xmlns:a="http://schemas.openxmlformats.org/drawingml/2006/main">
+              <a:graphicData uri="http://schemas.openxmlformats.org/drawingml/2006/picture">
+                <pic:pic xmlns:pic="http://schemas.openxmlformats.org/drawingml/2006/picture">
+                  <pic:nvPicPr>
+                    <pic:cNvPr id="0" name="" descr=""/>
+                    <pic:cNvPicPr>
+                      <a:picLocks noChangeAspect="1" noChangeArrowheads="1"/>
+                    </pic:cNvPicPr>
+                  </pic:nvPicPr>
+                  <pic:blipFill>
+                    <a:blip r:embed="rId12" cstate="none"/>
+                    <a:srcRect/>
+                    <a:stretch>
+                      <a:fillRect/>
+                    </a:stretch>
+                  </pic:blipFill>
+                  <pic:spPr bwMode="auto">
+                    <a:xfrm>
+                      <a:off x="0" y="0"/>
+                      <a:ext cx="4381500" cy="2609850"/>
+                    </a:xfrm>
+                    <a:prstGeom prst="rect">
+                      <a:avLst/>
+                    </a:prstGeom>
+                  </pic:spPr>
+                </pic:pic>
+              </a:graphicData>
+            </a:graphic>
+          </wp:inline>
+        </w:drawing>
       </w:r>
     </w:p>
     <w:p>
@@ -5743,7 +6045,53 @@
         <w:t xml:space="preserve">Figure 5. Absence of the cortical theta-gamma PAC deficit reported in SOD1 and FUS models. </w:t>
       </w:r>
       <w:r>
-        <w:t xml:space="preserve">Cortical theta-high-gamma modulation index during REM across timepoints in knockout and wild-type mice (pre-specified primary test), with hippocampal and wake comparisons for context.</w:t>
+        <w:t xml:space="preserve">Theta-high-gamma modulation index across timepoints for knockout and wild-type mice in both channels (CA3, S1/PtA) and all vigilance states; the boxed cortical REM panel is the pre-specified Scekic-Zahirovic replication test, which shows no genotype difference at any timepoint.</w:t>
+      </w:r>
+    </w:p>
+    <w:p>
+      <w:pPr>
+        <w:spacing w:after="40" w:before="120"/>
+        <w:jc w:val="center"/>
+      </w:pPr>
+      <w:r>
+        <w:drawing>
+          <wp:inline distT="0" distB="0" distL="0" distR="0">
+            <wp:extent cx="4286250" cy="2362200"/>
+            <wp:effectExtent t="0" r="0" b="0" l="0"/>
+            <wp:docPr id="1" name="" descr="" title=""/>
+            <wp:cNvGraphicFramePr>
+              <a:graphicFrameLocks xmlns:a="http://schemas.openxmlformats.org/drawingml/2006/main" noChangeAspect="1"/>
+            </wp:cNvGraphicFramePr>
+            <a:graphic xmlns:a="http://schemas.openxmlformats.org/drawingml/2006/main">
+              <a:graphicData uri="http://schemas.openxmlformats.org/drawingml/2006/picture">
+                <pic:pic xmlns:pic="http://schemas.openxmlformats.org/drawingml/2006/picture">
+                  <pic:nvPicPr>
+                    <pic:cNvPr id="0" name="" descr=""/>
+                    <pic:cNvPicPr>
+                      <a:picLocks noChangeAspect="1" noChangeArrowheads="1"/>
+                    </pic:cNvPicPr>
+                  </pic:nvPicPr>
+                  <pic:blipFill>
+                    <a:blip r:embed="rId13" cstate="none"/>
+                    <a:srcRect/>
+                    <a:stretch>
+                      <a:fillRect/>
+                    </a:stretch>
+                  </pic:blipFill>
+                  <pic:spPr bwMode="auto">
+                    <a:xfrm>
+                      <a:off x="0" y="0"/>
+                      <a:ext cx="4286250" cy="2362200"/>
+                    </a:xfrm>
+                    <a:prstGeom prst="rect">
+                      <a:avLst/>
+                    </a:prstGeom>
+                  </pic:spPr>
+                </pic:pic>
+              </a:graphicData>
+            </a:graphic>
+          </wp:inline>
+        </w:drawing>
       </w:r>
     </w:p>
     <w:p>
@@ -5755,10 +6103,527 @@
           <w:b/>
           <w:bCs/>
         </w:rPr>
-        <w:t xml:space="preserve">Figure 6. Circuit dissociation and pre-symptomatic signatures. </w:t>
-      </w:r>
-      <w:r>
-        <w:t xml:space="preserve">CA3-CTX decorrelation trajectory in knockout versus wild-type mice; pre-symptomatic sleep-spindle duration; relationship between the 3-month aperiodic exponent and 12-month complexity.</w:t>
+        <w:t xml:space="preserve">Figure 6. Circuit dissociation between hippocampus and cortex. </w:t>
+      </w:r>
+      <w:r>
+        <w:t xml:space="preserve">CA3\u2013S1/PtA decorrelation (1 \u2212 Spearman \u03c1) across timepoints; knockout mice show progressively increasing hippocampal-cortical decorrelation (\u03c1 = 0.43, p = 0.007) whereas the wild-type trajectory is flat, indicating a developing functional disconnection.</w:t>
+      </w:r>
+    </w:p>
+    <w:p>
+      <w:pPr>
+        <w:pStyle w:val="Heading1"/>
+      </w:pPr>
+      <w:r>
+        <w:t xml:space="preserve">Supplementary Materials</w:t>
+      </w:r>
+    </w:p>
+    <w:p>
+      <w:pPr>
+        <w:spacing w:after="160" w:line="276"/>
+      </w:pPr>
+      <w:r>
+        <w:t xml:space="preserve">Supplementary Methods. Expanded description of the sleep-state classification thresholds and the threshold-grid sensitivity procedure; the Tort modulation-index computation (phase and amplitude band definitions, bin count, surrogate normalization); the bias-corrected bootstrap confidence-interval procedure; the mixed-effects model specification and the cluster-robust sensitivity analysis; and the cross-validation and label-permutation procedures used for classification analysis.</w:t>
+      </w:r>
+    </w:p>
+    <w:p>
+      <w:pPr>
+        <w:spacing w:after="160" w:line="276"/>
+      </w:pPr>
+      <w:r>
+        <w:rPr>
+          <w:b/>
+          <w:bCs/>
+        </w:rPr>
+        <w:t xml:space="preserve">Table S1. Session-level sensitivity analysis (Scenario B). </w:t>
+      </w:r>
+      <w:r>
+        <w:t xml:space="preserve">Full feature-by-timepoint comparisons treating each recording session as the unit of analysis, with group means, Cohen\u2019s d and 95% confidence intervals, and raw and FDR-adjusted p-values.</w:t>
+      </w:r>
+    </w:p>
+    <w:p>
+      <w:pPr>
+        <w:spacing w:after="160" w:line="276"/>
+      </w:pPr>
+      <w:r>
+        <w:rPr>
+          <w:b/>
+          <w:bCs/>
+        </w:rPr>
+        <w:t xml:space="preserve">Table S2. Mixed-effects models. </w:t>
+      </w:r>
+      <w:r>
+        <w:t xml:space="preserve">Complete genotype \u00D7 time interaction results for all tested features, reporting the mixed-model p-value, the cluster-robust (by animal) p-value, the random-effect variance estimate, and the reported value (robust where the random-effect variance approached the boundary).</w:t>
+      </w:r>
+    </w:p>
+    <w:p>
+      <w:pPr>
+        <w:spacing w:after="160" w:line="276"/>
+      </w:pPr>
+      <w:r>
+        <w:rPr>
+          <w:b/>
+          <w:bCs/>
+        </w:rPr>
+        <w:t xml:space="preserve">Table S3. Sleep-state transition statistics. </w:t>
+      </w:r>
+      <w:r>
+        <w:t xml:space="preserve">Full transition-probability, dwell-time, and transition-rate comparisons between genotypes at every timepoint, with effect sizes and FDR-adjusted p-values.</w:t>
+      </w:r>
+    </w:p>
+    <w:p>
+      <w:pPr>
+        <w:spacing w:after="160" w:line="276"/>
+      </w:pPr>
+      <w:r>
+        <w:rPr>
+          <w:b/>
+          <w:bCs/>
+        </w:rPr>
+        <w:t xml:space="preserve">Table S4. Secondary timepoint analyses (6 and 7 months). </w:t>
+      </w:r>
+      <w:r>
+        <w:t xml:space="preserve">Exploratory feature comparisons at the timepoints not included in the pre-specified primary analysis.</w:t>
+      </w:r>
+    </w:p>
+    <w:p>
+      <w:pPr>
+        <w:spacing w:after="160" w:line="276"/>
+      </w:pPr>
+      <w:r>
+        <w:rPr>
+          <w:b/>
+          <w:bCs/>
+        </w:rPr>
+        <w:t xml:space="preserve">Table S5. Cross-validated classification performance. </w:t>
+      </w:r>
+      <w:r>
+        <w:t xml:space="preserve">For each headline feature: in-sample AUC, leave-one-out cross-validated AUC, repeated stratified k-fold AUC (mean \u00B1 SD), and label-permutation p-value.</w:t>
+      </w:r>
+    </w:p>
+    <w:p>
+      <w:pPr>
+        <w:spacing w:after="160" w:line="276"/>
+      </w:pPr>
+      <w:r>
+        <w:rPr>
+          <w:b/>
+          <w:bCs/>
+        </w:rPr>
+        <w:t xml:space="preserve">Table S6. Staging-threshold sensitivity grid. </w:t>
+      </w:r>
+      <w:r>
+        <w:t xml:space="preserve">Genotype effect size and significance for each headline REM feature across all 81 threshold combinations of the band-power classifier.</w:t>
+      </w:r>
+    </w:p>
+    <w:p>
+      <w:pPr>
+        <w:shd w:fill="FFF2CC" w:val="clear"/>
+        <w:spacing w:after="160" w:line="276"/>
+      </w:pPr>
+      <w:r>
+        <w:rPr>
+          <w:i/>
+          <w:iCs/>
+          <w:color w:val="7F6000"/>
+        </w:rPr>
+        <w:t xml:space="preserve">[TODO] Figure S1. Animal-flow diagram \u2014 CONSORT-style accounting of animals enrolled, contributing usable recordings at each timepoint, and lost to attrition, by genotype. Build from final animal numbers.</w:t>
+      </w:r>
+    </w:p>
+    <w:p>
+      <w:pPr>
+        <w:spacing w:after="40" w:before="120"/>
+        <w:jc w:val="center"/>
+      </w:pPr>
+      <w:r>
+        <w:drawing>
+          <wp:inline distT="0" distB="0" distL="0" distR="0">
+            <wp:extent cx="4381500" cy="1800225"/>
+            <wp:effectExtent t="0" r="0" b="0" l="0"/>
+            <wp:docPr id="1" name="" descr="" title=""/>
+            <wp:cNvGraphicFramePr>
+              <a:graphicFrameLocks xmlns:a="http://schemas.openxmlformats.org/drawingml/2006/main" noChangeAspect="1"/>
+            </wp:cNvGraphicFramePr>
+            <a:graphic xmlns:a="http://schemas.openxmlformats.org/drawingml/2006/main">
+              <a:graphicData uri="http://schemas.openxmlformats.org/drawingml/2006/picture">
+                <pic:pic xmlns:pic="http://schemas.openxmlformats.org/drawingml/2006/picture">
+                  <pic:nvPicPr>
+                    <pic:cNvPr id="0" name="" descr=""/>
+                    <pic:cNvPicPr>
+                      <a:picLocks noChangeAspect="1" noChangeArrowheads="1"/>
+                    </pic:cNvPicPr>
+                  </pic:nvPicPr>
+                  <pic:blipFill>
+                    <a:blip r:embed="rId14" cstate="none"/>
+                    <a:srcRect/>
+                    <a:stretch>
+                      <a:fillRect/>
+                    </a:stretch>
+                  </pic:blipFill>
+                  <pic:spPr bwMode="auto">
+                    <a:xfrm>
+                      <a:off x="0" y="0"/>
+                      <a:ext cx="4381500" cy="1800225"/>
+                    </a:xfrm>
+                    <a:prstGeom prst="rect">
+                      <a:avLst/>
+                    </a:prstGeom>
+                  </pic:spPr>
+                </pic:pic>
+              </a:graphicData>
+            </a:graphic>
+          </wp:inline>
+        </w:drawing>
+      </w:r>
+    </w:p>
+    <w:p>
+      <w:pPr>
+        <w:spacing w:after="160" w:line="276"/>
+      </w:pPr>
+      <w:r>
+        <w:rPr>
+          <w:b/>
+          <w:bCs/>
+        </w:rPr>
+        <w:t xml:space="preserve">Figure S2. Full cortical phase-amplitude coupling matrix. </w:t>
+      </w:r>
+      <w:r>
+        <w:t xml:space="preserve">Genotype effect size (Cohen\u2019s d, knockout \u2212 wild-type) for every phase band (theta, alpha) against both gamma amplitude bands (low, high) during cortical REM at the principal timepoints; values are small and no cell reaches FDR significance, supporting a frequency-general PAC null.</w:t>
+      </w:r>
+    </w:p>
+    <w:p>
+      <w:pPr>
+        <w:spacing w:after="40" w:before="120"/>
+        <w:jc w:val="center"/>
+      </w:pPr>
+      <w:r>
+        <w:drawing>
+          <wp:inline distT="0" distB="0" distL="0" distR="0">
+            <wp:extent cx="4095750" cy="2609850"/>
+            <wp:effectExtent t="0" r="0" b="0" l="0"/>
+            <wp:docPr id="1" name="" descr="" title=""/>
+            <wp:cNvGraphicFramePr>
+              <a:graphicFrameLocks xmlns:a="http://schemas.openxmlformats.org/drawingml/2006/main" noChangeAspect="1"/>
+            </wp:cNvGraphicFramePr>
+            <a:graphic xmlns:a="http://schemas.openxmlformats.org/drawingml/2006/main">
+              <a:graphicData uri="http://schemas.openxmlformats.org/drawingml/2006/picture">
+                <pic:pic xmlns:pic="http://schemas.openxmlformats.org/drawingml/2006/picture">
+                  <pic:nvPicPr>
+                    <pic:cNvPr id="0" name="" descr=""/>
+                    <pic:cNvPicPr>
+                      <a:picLocks noChangeAspect="1" noChangeArrowheads="1"/>
+                    </pic:cNvPicPr>
+                  </pic:nvPicPr>
+                  <pic:blipFill>
+                    <a:blip r:embed="rId15" cstate="none"/>
+                    <a:srcRect/>
+                    <a:stretch>
+                      <a:fillRect/>
+                    </a:stretch>
+                  </pic:blipFill>
+                  <pic:spPr bwMode="auto">
+                    <a:xfrm>
+                      <a:off x="0" y="0"/>
+                      <a:ext cx="4095750" cy="2609850"/>
+                    </a:xfrm>
+                    <a:prstGeom prst="rect">
+                      <a:avLst/>
+                    </a:prstGeom>
+                  </pic:spPr>
+                </pic:pic>
+              </a:graphicData>
+            </a:graphic>
+          </wp:inline>
+        </w:drawing>
+      </w:r>
+    </w:p>
+    <w:p>
+      <w:pPr>
+        <w:spacing w:after="160" w:line="276"/>
+      </w:pPr>
+      <w:r>
+        <w:rPr>
+          <w:b/>
+          <w:bCs/>
+        </w:rPr>
+        <w:t xml:space="preserve">Figure S3. Power-confound check. </w:t>
+      </w:r>
+      <w:r>
+        <w:t xml:space="preserve">Genotype effect size over time for REM theta power (the PAC phase band) and REM gamma power (the PAC amplitude band); the near-zero gamma-power differences indicate that the PAC null does not arise from a gamma-power confound.</w:t>
+      </w:r>
+    </w:p>
+    <w:p>
+      <w:pPr>
+        <w:spacing w:after="40" w:before="120"/>
+        <w:jc w:val="center"/>
+      </w:pPr>
+      <w:r>
+        <w:drawing>
+          <wp:inline distT="0" distB="0" distL="0" distR="0">
+            <wp:extent cx="4286250" cy="2647950"/>
+            <wp:effectExtent t="0" r="0" b="0" l="0"/>
+            <wp:docPr id="1" name="" descr="" title=""/>
+            <wp:cNvGraphicFramePr>
+              <a:graphicFrameLocks xmlns:a="http://schemas.openxmlformats.org/drawingml/2006/main" noChangeAspect="1"/>
+            </wp:cNvGraphicFramePr>
+            <a:graphic xmlns:a="http://schemas.openxmlformats.org/drawingml/2006/main">
+              <a:graphicData uri="http://schemas.openxmlformats.org/drawingml/2006/picture">
+                <pic:pic xmlns:pic="http://schemas.openxmlformats.org/drawingml/2006/picture">
+                  <pic:nvPicPr>
+                    <pic:cNvPr id="0" name="" descr=""/>
+                    <pic:cNvPicPr>
+                      <a:picLocks noChangeAspect="1" noChangeArrowheads="1"/>
+                    </pic:cNvPicPr>
+                  </pic:nvPicPr>
+                  <pic:blipFill>
+                    <a:blip r:embed="rId16" cstate="none"/>
+                    <a:srcRect/>
+                    <a:stretch>
+                      <a:fillRect/>
+                    </a:stretch>
+                  </pic:blipFill>
+                  <pic:spPr bwMode="auto">
+                    <a:xfrm>
+                      <a:off x="0" y="0"/>
+                      <a:ext cx="4286250" cy="2647950"/>
+                    </a:xfrm>
+                    <a:prstGeom prst="rect">
+                      <a:avLst/>
+                    </a:prstGeom>
+                  </pic:spPr>
+                </pic:pic>
+              </a:graphicData>
+            </a:graphic>
+          </wp:inline>
+        </w:drawing>
+      </w:r>
+    </w:p>
+    <w:p>
+      <w:pPr>
+        <w:spacing w:after="40" w:before="120"/>
+        <w:jc w:val="center"/>
+      </w:pPr>
+      <w:r>
+        <w:drawing>
+          <wp:inline distT="0" distB="0" distL="0" distR="0">
+            <wp:extent cx="3619500" cy="2371725"/>
+            <wp:effectExtent t="0" r="0" b="0" l="0"/>
+            <wp:docPr id="1" name="" descr="" title=""/>
+            <wp:cNvGraphicFramePr>
+              <a:graphicFrameLocks xmlns:a="http://schemas.openxmlformats.org/drawingml/2006/main" noChangeAspect="1"/>
+            </wp:cNvGraphicFramePr>
+            <a:graphic xmlns:a="http://schemas.openxmlformats.org/drawingml/2006/main">
+              <a:graphicData uri="http://schemas.openxmlformats.org/drawingml/2006/picture">
+                <pic:pic xmlns:pic="http://schemas.openxmlformats.org/drawingml/2006/picture">
+                  <pic:nvPicPr>
+                    <pic:cNvPr id="0" name="" descr=""/>
+                    <pic:cNvPicPr>
+                      <a:picLocks noChangeAspect="1" noChangeArrowheads="1"/>
+                    </pic:cNvPicPr>
+                  </pic:nvPicPr>
+                  <pic:blipFill>
+                    <a:blip r:embed="rId17" cstate="none"/>
+                    <a:srcRect/>
+                    <a:stretch>
+                      <a:fillRect/>
+                    </a:stretch>
+                  </pic:blipFill>
+                  <pic:spPr bwMode="auto">
+                    <a:xfrm>
+                      <a:off x="0" y="0"/>
+                      <a:ext cx="3619500" cy="2371725"/>
+                    </a:xfrm>
+                    <a:prstGeom prst="rect">
+                      <a:avLst/>
+                    </a:prstGeom>
+                  </pic:spPr>
+                </pic:pic>
+              </a:graphicData>
+            </a:graphic>
+          </wp:inline>
+        </w:drawing>
+      </w:r>
+    </w:p>
+    <w:p>
+      <w:pPr>
+        <w:spacing w:after="160" w:line="276"/>
+      </w:pPr>
+      <w:r>
+        <w:rPr>
+          <w:b/>
+          <w:bCs/>
+        </w:rPr>
+        <w:t xml:space="preserve">Figure S4. Cross-validated classification. </w:t>
+      </w:r>
+      <w:r>
+        <w:t xml:space="preserve">Forest plot of in-sample, leave-one-out, and repeated k-fold AUC for the headline features (top), and the label-permutation null distribution for the strongest classifier, 4-month REM relative beta (observed AUC = 0.92, empirical p = 0.004; bottom).</w:t>
+      </w:r>
+    </w:p>
+    <w:p>
+      <w:pPr>
+        <w:spacing w:after="40" w:before="120"/>
+        <w:jc w:val="center"/>
+      </w:pPr>
+      <w:r>
+        <w:drawing>
+          <wp:inline distT="0" distB="0" distL="0" distR="0">
+            <wp:extent cx="4095750" cy="4314825"/>
+            <wp:effectExtent t="0" r="0" b="0" l="0"/>
+            <wp:docPr id="1" name="" descr="" title=""/>
+            <wp:cNvGraphicFramePr>
+              <a:graphicFrameLocks xmlns:a="http://schemas.openxmlformats.org/drawingml/2006/main" noChangeAspect="1"/>
+            </wp:cNvGraphicFramePr>
+            <a:graphic xmlns:a="http://schemas.openxmlformats.org/drawingml/2006/main">
+              <a:graphicData uri="http://schemas.openxmlformats.org/drawingml/2006/picture">
+                <pic:pic xmlns:pic="http://schemas.openxmlformats.org/drawingml/2006/picture">
+                  <pic:nvPicPr>
+                    <pic:cNvPr id="0" name="" descr=""/>
+                    <pic:cNvPicPr>
+                      <a:picLocks noChangeAspect="1" noChangeArrowheads="1"/>
+                    </pic:cNvPicPr>
+                  </pic:nvPicPr>
+                  <pic:blipFill>
+                    <a:blip r:embed="rId18" cstate="none"/>
+                    <a:srcRect/>
+                    <a:stretch>
+                      <a:fillRect/>
+                    </a:stretch>
+                  </pic:blipFill>
+                  <pic:spPr bwMode="auto">
+                    <a:xfrm>
+                      <a:off x="0" y="0"/>
+                      <a:ext cx="4095750" cy="4314825"/>
+                    </a:xfrm>
+                    <a:prstGeom prst="rect">
+                      <a:avLst/>
+                    </a:prstGeom>
+                  </pic:spPr>
+                </pic:pic>
+              </a:graphicData>
+            </a:graphic>
+          </wp:inline>
+        </w:drawing>
+      </w:r>
+    </w:p>
+    <w:p>
+      <w:pPr>
+        <w:spacing w:after="160" w:line="276"/>
+      </w:pPr>
+      <w:r>
+        <w:rPr>
+          <w:b/>
+          <w:bCs/>
+        </w:rPr>
+        <w:t xml:space="preserve">Figure S5. Genotype classification by headline features. </w:t>
+      </w:r>
+      <w:r>
+        <w:t xml:space="preserve">Receiver-operating-characteristic curves for animal-level genotype classification by each headline EEG feature, with in-sample AUC; the acute 4-month REM beta and theta/delta features and the end-stage beta reversal are the strongest discriminators, while the 3-month aperiodic exponent is near chance.</w:t>
+      </w:r>
+    </w:p>
+    <w:p>
+      <w:pPr>
+        <w:spacing w:after="40" w:before="120"/>
+        <w:jc w:val="center"/>
+      </w:pPr>
+      <w:r>
+        <w:drawing>
+          <wp:inline distT="0" distB="0" distL="0" distR="0">
+            <wp:extent cx="4381500" cy="1619250"/>
+            <wp:effectExtent t="0" r="0" b="0" l="0"/>
+            <wp:docPr id="1" name="" descr="" title=""/>
+            <wp:cNvGraphicFramePr>
+              <a:graphicFrameLocks xmlns:a="http://schemas.openxmlformats.org/drawingml/2006/main" noChangeAspect="1"/>
+            </wp:cNvGraphicFramePr>
+            <a:graphic xmlns:a="http://schemas.openxmlformats.org/drawingml/2006/main">
+              <a:graphicData uri="http://schemas.openxmlformats.org/drawingml/2006/picture">
+                <pic:pic xmlns:pic="http://schemas.openxmlformats.org/drawingml/2006/picture">
+                  <pic:nvPicPr>
+                    <pic:cNvPr id="0" name="" descr=""/>
+                    <pic:cNvPicPr>
+                      <a:picLocks noChangeAspect="1" noChangeArrowheads="1"/>
+                    </pic:cNvPicPr>
+                  </pic:nvPicPr>
+                  <pic:blipFill>
+                    <a:blip r:embed="rId19" cstate="none"/>
+                    <a:srcRect/>
+                    <a:stretch>
+                      <a:fillRect/>
+                    </a:stretch>
+                  </pic:blipFill>
+                  <pic:spPr bwMode="auto">
+                    <a:xfrm>
+                      <a:off x="0" y="0"/>
+                      <a:ext cx="4381500" cy="1619250"/>
+                    </a:xfrm>
+                    <a:prstGeom prst="rect">
+                      <a:avLst/>
+                    </a:prstGeom>
+                  </pic:spPr>
+                </pic:pic>
+              </a:graphicData>
+            </a:graphic>
+          </wp:inline>
+        </w:drawing>
+      </w:r>
+    </w:p>
+    <w:p>
+      <w:pPr>
+        <w:spacing w:after="40" w:before="120"/>
+        <w:jc w:val="center"/>
+      </w:pPr>
+      <w:r>
+        <w:drawing>
+          <wp:inline distT="0" distB="0" distL="0" distR="0">
+            <wp:extent cx="3619500" cy="3267075"/>
+            <wp:effectExtent t="0" r="0" b="0" l="0"/>
+            <wp:docPr id="1" name="" descr="" title=""/>
+            <wp:cNvGraphicFramePr>
+              <a:graphicFrameLocks xmlns:a="http://schemas.openxmlformats.org/drawingml/2006/main" noChangeAspect="1"/>
+            </wp:cNvGraphicFramePr>
+            <a:graphic xmlns:a="http://schemas.openxmlformats.org/drawingml/2006/main">
+              <a:graphicData uri="http://schemas.openxmlformats.org/drawingml/2006/picture">
+                <pic:pic xmlns:pic="http://schemas.openxmlformats.org/drawingml/2006/picture">
+                  <pic:nvPicPr>
+                    <pic:cNvPr id="0" name="" descr=""/>
+                    <pic:cNvPicPr>
+                      <a:picLocks noChangeAspect="1" noChangeArrowheads="1"/>
+                    </pic:cNvPicPr>
+                  </pic:nvPicPr>
+                  <pic:blipFill>
+                    <a:blip r:embed="rId20" cstate="none"/>
+                    <a:srcRect/>
+                    <a:stretch>
+                      <a:fillRect/>
+                    </a:stretch>
+                  </pic:blipFill>
+                  <pic:spPr bwMode="auto">
+                    <a:xfrm>
+                      <a:off x="0" y="0"/>
+                      <a:ext cx="3619500" cy="3267075"/>
+                    </a:xfrm>
+                    <a:prstGeom prst="rect">
+                      <a:avLst/>
+                    </a:prstGeom>
+                  </pic:spPr>
+                </pic:pic>
+              </a:graphicData>
+            </a:graphic>
+          </wp:inline>
+        </w:drawing>
+      </w:r>
+    </w:p>
+    <w:p>
+      <w:pPr>
+        <w:spacing w:after="160" w:line="276"/>
+      </w:pPr>
+      <w:r>
+        <w:rPr>
+          <w:b/>
+          <w:bCs/>
+        </w:rPr>
+        <w:t xml:space="preserve">Figure S6. Staging-sensitivity and state separation. </w:t>
+      </w:r>
+      <w:r>
+        <w:t xml:space="preserve">Genotype effect size for each headline REM feature across the 9-point threshold grid (top): the 4-month beta and theta/delta effects remain positive and the 12-month beta effect remains negative throughout, showing the findings are not artifacts of any single staging cutoff. The theta-delta-plane state-separation diagnostic (bottom) provides visual justification for the band-power vigilance-state classification.</w:t>
       </w:r>
     </w:p>
     <w:sectPr>

</xml_diff>

<commit_message>
Add REM validation (video immobility, architecture, CA3 theta): Results subsection, Table S7, Fig S7 slot
</commit_message>
<xml_diff>
--- a/manuscript/manuscript_v2_brain.docx
+++ b/manuscript/manuscript_v2_brain.docx
@@ -682,7 +682,15 @@
         <w:pStyle w:val="Heading2"/>
       </w:pPr>
       <w:r>
-        <w:t xml:space="preserve">Corticomotor predictive coupling is preserved across the disease course</w:t>
+        <w:t xml:space="preserve">Synchronous video confirms that REM-classified epochs are behaviourally quiescent</w:t>
+      </w:r>
+    </w:p>
+    <w:p>
+      <w:pPr>
+        <w:spacing w:after="160" w:line="276"/>
+      </w:pPr>
+      <w:r>
+        <w:t xml:space="preserve">Because vigilance states were defined from EEG without electromyography, we used the synchronous video to test the principal concern for EMG-free staging: that theta-rich, low-delta epochs labelled REM might instead be active, exploratory wakefulness. Per-epoch movement was quantified as frame-to-frame video motion energy and aligned to the EEG epochs. Three convergent results support the REM classification. First, REM occupied a physiological fraction of recording time (6.7\u201311.6% of total epochs; ~20\u201329% of sleep), consistent with normal mouse REM and inconsistent with substantial active-wake inflation. Second, of the epochs the classifier labelled REM, 94.8% were behaviourally immobile, the highest immobile fraction of any state (REM 95%, NREM 90%, wake 89% immobile); REM motion was significantly lower than wake (Mann-Whitney p &lt; 0.001) and, as expected for the state with the most complete atonia, was the lowest of the three states. Because average wake motion is dominated by quiet rest, the most informative contrast is with active wake specifically: REM motion was far below the high-movement (active) wake epochs that constitute the actual confound. Third, the staging reproduced canonical sleep architecture \u2014 REM was rarely entered directly from wake (wake\u2192REM transition probability 0.07), showed self-maintenance, and had physiological bout durations \u2014 and hippocampal CA3 theta was greatest during REM, with a ~6.5 Hz peak characteristic of rodent REM theta (CA3 theta/delta REM vs wake Cohen\u2019s d = +0.36). Together these analyses indicate that the EEG-defined REM state is immobile, theta-dominant, hippocampally appropriate, and transitionally consistent with physiological REM, rather than misclassified active wakefulness; the formal limitation that video immobility is a surrogate for, not a direct measurement of, muscle atonia is noted in the Discussion.</w:t>
       </w:r>
     </w:p>
     <w:p>
@@ -806,7 +814,7 @@
         <w:spacing w:after="160" w:line="276"/>
       </w:pPr>
       <w:r>
-        <w:t xml:space="preserve">This study has limitations. The end-stage timepoints involved small samples; although the effects observed there were large, they are interpreted with caution, and the 12-month state-transition result in particular rests on few animals — the within-animal longitudinal design and the mixed-effects modelling mitigate but do not eliminate this concern. Sleep-state classification used relative band-power criteria rather than concurrent electromyography; while internally consistent and yielding plausible state distributions, it lacks the specificity of polysomnographic staging. The kainic-acid challenge at 4 months provides a controlled probe of network vulnerability but means the acute timepoint reflects a perturbed rather than a spontaneous state. Finally, the present account is primarily of the network trajectory and its behavioural correlates; while the behavioural battery establishes multi-domain functional impairment, the small phenotyped sample limits individual-level brain-behaviour inference, and the histological data that would anchor the trajectory to a cellular substrate are still being integrated and are required for the full mechanistic interpretation.</w:t>
+        <w:t xml:space="preserve">This study has limitations. The end-stage timepoints involved small samples; although the effects observed there were large, they are interpreted with caution, and the 12-month state-transition result in particular rests on few animals — the within-animal longitudinal design and the mixed-effects modelling mitigate but do not eliminate this concern. Sleep-state classification used relative band-power criteria rather than concurrent electromyography; although synchronous video confirmed that REM-classified epochs were behaviourally quiescent, occurred at physiological frequency, arose with appropriate sleep architecture, and carried the expected hippocampal theta signature, video immobility is a surrogate for rather than a direct measurement of muscle atonia, and the staging lacks the full specificity of polysomnography. The kainic-acid challenge at 4 months provides a controlled probe of network vulnerability but means the acute timepoint reflects a perturbed rather than a spontaneous state. Finally, the present account is primarily of the network trajectory and its behavioural correlates; while the behavioural battery establishes multi-domain functional impairment, the small phenotyped sample limits individual-level brain-behaviour inference, and the histological data that would anchor the trajectory to a cellular substrate are still being integrated and are required for the full mechanistic interpretation.</w:t>
       </w:r>
     </w:p>
     <w:p>
@@ -12723,6 +12731,1030 @@
     </w:p>
     <w:p>
       <w:pPr>
+        <w:spacing w:after="60" w:before="200"/>
+      </w:pPr>
+      <w:r>
+        <w:rPr>
+          <w:b/>
+          <w:bCs/>
+        </w:rPr>
+        <w:t xml:space="preserve">Table S7. Validation of EEG-defined REM against synchronous video.</w:t>
+      </w:r>
+    </w:p>
+    <w:tbl>
+      <w:tblPr>
+        <w:tblW w:type="dxa" w:w="8200"/>
+        <w:tblBorders>
+          <w:top w:val="single" w:color="auto" w:sz="4"/>
+          <w:left w:val="single" w:color="auto" w:sz="4"/>
+          <w:bottom w:val="single" w:color="auto" w:sz="4"/>
+          <w:right w:val="single" w:color="auto" w:sz="4"/>
+          <w:insideH w:val="single" w:color="auto" w:sz="4"/>
+          <w:insideV w:val="single" w:color="auto" w:sz="4"/>
+        </w:tblBorders>
+      </w:tblPr>
+      <w:tblGrid>
+        <w:gridCol w:w="3100"/>
+        <w:gridCol w:w="2100"/>
+        <w:gridCol w:w="3000"/>
+      </w:tblGrid>
+      <w:tr>
+        <w:trPr>
+          <w:tblHeader/>
+        </w:trPr>
+        <w:tc>
+          <w:tcPr>
+            <w:tcW w:type="dxa" w:w="3100"/>
+            <w:tcBorders>
+              <w:top w:val="single" w:color="CCCCCC" w:sz="1"/>
+              <w:left w:val="single" w:color="CCCCCC" w:sz="1"/>
+              <w:bottom w:val="single" w:color="CCCCCC" w:sz="1"/>
+              <w:right w:val="single" w:color="CCCCCC" w:sz="1"/>
+            </w:tcBorders>
+            <w:shd w:fill="D5E8F0" w:val="clear"/>
+            <w:tcMar>
+              <w:top w:type="dxa" w:w="60"/>
+              <w:left w:type="dxa" w:w="100"/>
+              <w:bottom w:type="dxa" w:w="60"/>
+              <w:right w:type="dxa" w:w="100"/>
+            </w:tcMar>
+          </w:tcPr>
+          <w:p>
+            <w:pPr>
+              <w:spacing w:after="0"/>
+            </w:pPr>
+            <w:r>
+              <w:rPr>
+                <w:rFonts w:ascii="Arial" w:cs="Arial" w:eastAsia="Arial" w:hAnsi="Arial"/>
+                <w:b/>
+                <w:bCs/>
+                <w:sz w:val="18"/>
+                <w:szCs w:val="18"/>
+              </w:rPr>
+              <w:t xml:space="preserve">Validation metric</w:t>
+            </w:r>
+          </w:p>
+        </w:tc>
+        <w:tc>
+          <w:tcPr>
+            <w:tcW w:type="dxa" w:w="2100"/>
+            <w:tcBorders>
+              <w:top w:val="single" w:color="CCCCCC" w:sz="1"/>
+              <w:left w:val="single" w:color="CCCCCC" w:sz="1"/>
+              <w:bottom w:val="single" w:color="CCCCCC" w:sz="1"/>
+              <w:right w:val="single" w:color="CCCCCC" w:sz="1"/>
+            </w:tcBorders>
+            <w:shd w:fill="D5E8F0" w:val="clear"/>
+            <w:tcMar>
+              <w:top w:type="dxa" w:w="60"/>
+              <w:left w:type="dxa" w:w="100"/>
+              <w:bottom w:type="dxa" w:w="60"/>
+              <w:right w:type="dxa" w:w="100"/>
+            </w:tcMar>
+          </w:tcPr>
+          <w:p>
+            <w:pPr>
+              <w:spacing w:after="0"/>
+            </w:pPr>
+            <w:r>
+              <w:rPr>
+                <w:rFonts w:ascii="Arial" w:cs="Arial" w:eastAsia="Arial" w:hAnsi="Arial"/>
+                <w:b/>
+                <w:bCs/>
+                <w:sz w:val="18"/>
+                <w:szCs w:val="18"/>
+              </w:rPr>
+              <w:t xml:space="preserve">Value</w:t>
+            </w:r>
+          </w:p>
+        </w:tc>
+        <w:tc>
+          <w:tcPr>
+            <w:tcW w:type="dxa" w:w="3000"/>
+            <w:tcBorders>
+              <w:top w:val="single" w:color="CCCCCC" w:sz="1"/>
+              <w:left w:val="single" w:color="CCCCCC" w:sz="1"/>
+              <w:bottom w:val="single" w:color="CCCCCC" w:sz="1"/>
+              <w:right w:val="single" w:color="CCCCCC" w:sz="1"/>
+            </w:tcBorders>
+            <w:shd w:fill="D5E8F0" w:val="clear"/>
+            <w:tcMar>
+              <w:top w:type="dxa" w:w="60"/>
+              <w:left w:type="dxa" w:w="100"/>
+              <w:bottom w:type="dxa" w:w="60"/>
+              <w:right w:type="dxa" w:w="100"/>
+            </w:tcMar>
+          </w:tcPr>
+          <w:p>
+            <w:pPr>
+              <w:spacing w:after="0"/>
+            </w:pPr>
+            <w:r>
+              <w:rPr>
+                <w:rFonts w:ascii="Arial" w:cs="Arial" w:eastAsia="Arial" w:hAnsi="Arial"/>
+                <w:b/>
+                <w:bCs/>
+                <w:sz w:val="18"/>
+                <w:szCs w:val="18"/>
+              </w:rPr>
+              <w:t xml:space="preserve">Expected / interpretation</w:t>
+            </w:r>
+          </w:p>
+        </w:tc>
+      </w:tr>
+      <w:tr>
+        <w:tc>
+          <w:tcPr>
+            <w:tcW w:type="dxa" w:w="3100"/>
+            <w:tcBorders>
+              <w:top w:val="single" w:color="CCCCCC" w:sz="1"/>
+              <w:left w:val="single" w:color="CCCCCC" w:sz="1"/>
+              <w:bottom w:val="single" w:color="CCCCCC" w:sz="1"/>
+              <w:right w:val="single" w:color="CCCCCC" w:sz="1"/>
+            </w:tcBorders>
+            <w:tcMar>
+              <w:top w:type="dxa" w:w="60"/>
+              <w:left w:type="dxa" w:w="100"/>
+              <w:bottom w:type="dxa" w:w="60"/>
+              <w:right w:type="dxa" w:w="100"/>
+            </w:tcMar>
+          </w:tcPr>
+          <w:p>
+            <w:pPr>
+              <w:spacing w:after="0"/>
+            </w:pPr>
+            <w:r>
+              <w:rPr>
+                <w:rFonts w:ascii="Arial" w:cs="Arial" w:eastAsia="Arial" w:hAnsi="Arial"/>
+                <w:b w:val="false"/>
+                <w:bCs w:val="false"/>
+                <w:sz w:val="18"/>
+                <w:szCs w:val="18"/>
+              </w:rPr>
+              <w:t xml:space="preserve">REM, % of total epochs</w:t>
+            </w:r>
+          </w:p>
+        </w:tc>
+        <w:tc>
+          <w:tcPr>
+            <w:tcW w:type="dxa" w:w="2100"/>
+            <w:tcBorders>
+              <w:top w:val="single" w:color="CCCCCC" w:sz="1"/>
+              <w:left w:val="single" w:color="CCCCCC" w:sz="1"/>
+              <w:bottom w:val="single" w:color="CCCCCC" w:sz="1"/>
+              <w:right w:val="single" w:color="CCCCCC" w:sz="1"/>
+            </w:tcBorders>
+            <w:tcMar>
+              <w:top w:type="dxa" w:w="60"/>
+              <w:left w:type="dxa" w:w="100"/>
+              <w:bottom w:type="dxa" w:w="60"/>
+              <w:right w:type="dxa" w:w="100"/>
+            </w:tcMar>
+          </w:tcPr>
+          <w:p>
+            <w:pPr>
+              <w:spacing w:after="0"/>
+            </w:pPr>
+            <w:r>
+              <w:rPr>
+                <w:rFonts w:ascii="Arial" w:cs="Arial" w:eastAsia="Arial" w:hAnsi="Arial"/>
+                <w:b w:val="false"/>
+                <w:bCs w:val="false"/>
+                <w:sz w:val="18"/>
+                <w:szCs w:val="18"/>
+              </w:rPr>
+              <w:t xml:space="preserve">6.7\u201311.6%</w:t>
+            </w:r>
+          </w:p>
+        </w:tc>
+        <w:tc>
+          <w:tcPr>
+            <w:tcW w:type="dxa" w:w="3000"/>
+            <w:tcBorders>
+              <w:top w:val="single" w:color="CCCCCC" w:sz="1"/>
+              <w:left w:val="single" w:color="CCCCCC" w:sz="1"/>
+              <w:bottom w:val="single" w:color="CCCCCC" w:sz="1"/>
+              <w:right w:val="single" w:color="CCCCCC" w:sz="1"/>
+            </w:tcBorders>
+            <w:tcMar>
+              <w:top w:type="dxa" w:w="60"/>
+              <w:left w:type="dxa" w:w="100"/>
+              <w:bottom w:type="dxa" w:w="60"/>
+              <w:right w:type="dxa" w:w="100"/>
+            </w:tcMar>
+          </w:tcPr>
+          <w:p>
+            <w:pPr>
+              <w:spacing w:after="0"/>
+            </w:pPr>
+            <w:r>
+              <w:rPr>
+                <w:rFonts w:ascii="Arial" w:cs="Arial" w:eastAsia="Arial" w:hAnsi="Arial"/>
+                <w:b w:val="false"/>
+                <w:bCs w:val="false"/>
+                <w:sz w:val="18"/>
+                <w:szCs w:val="18"/>
+              </w:rPr>
+              <w:t xml:space="preserve">physiological mouse REM (~5\u201310%)</w:t>
+            </w:r>
+          </w:p>
+        </w:tc>
+      </w:tr>
+      <w:tr>
+        <w:tc>
+          <w:tcPr>
+            <w:tcW w:type="dxa" w:w="3100"/>
+            <w:tcBorders>
+              <w:top w:val="single" w:color="CCCCCC" w:sz="1"/>
+              <w:left w:val="single" w:color="CCCCCC" w:sz="1"/>
+              <w:bottom w:val="single" w:color="CCCCCC" w:sz="1"/>
+              <w:right w:val="single" w:color="CCCCCC" w:sz="1"/>
+            </w:tcBorders>
+            <w:tcMar>
+              <w:top w:type="dxa" w:w="60"/>
+              <w:left w:type="dxa" w:w="100"/>
+              <w:bottom w:type="dxa" w:w="60"/>
+              <w:right w:type="dxa" w:w="100"/>
+            </w:tcMar>
+          </w:tcPr>
+          <w:p>
+            <w:pPr>
+              <w:spacing w:after="0"/>
+            </w:pPr>
+            <w:r>
+              <w:rPr>
+                <w:rFonts w:ascii="Arial" w:cs="Arial" w:eastAsia="Arial" w:hAnsi="Arial"/>
+                <w:b w:val="false"/>
+                <w:bCs w:val="false"/>
+                <w:sz w:val="18"/>
+                <w:szCs w:val="18"/>
+              </w:rPr>
+              <w:t xml:space="preserve">REM, % of sleep</w:t>
+            </w:r>
+          </w:p>
+        </w:tc>
+        <w:tc>
+          <w:tcPr>
+            <w:tcW w:type="dxa" w:w="2100"/>
+            <w:tcBorders>
+              <w:top w:val="single" w:color="CCCCCC" w:sz="1"/>
+              <w:left w:val="single" w:color="CCCCCC" w:sz="1"/>
+              <w:bottom w:val="single" w:color="CCCCCC" w:sz="1"/>
+              <w:right w:val="single" w:color="CCCCCC" w:sz="1"/>
+            </w:tcBorders>
+            <w:tcMar>
+              <w:top w:type="dxa" w:w="60"/>
+              <w:left w:type="dxa" w:w="100"/>
+              <w:bottom w:type="dxa" w:w="60"/>
+              <w:right w:type="dxa" w:w="100"/>
+            </w:tcMar>
+          </w:tcPr>
+          <w:p>
+            <w:pPr>
+              <w:spacing w:after="0"/>
+            </w:pPr>
+            <w:r>
+              <w:rPr>
+                <w:rFonts w:ascii="Arial" w:cs="Arial" w:eastAsia="Arial" w:hAnsi="Arial"/>
+                <w:b w:val="false"/>
+                <w:bCs w:val="false"/>
+                <w:sz w:val="18"/>
+                <w:szCs w:val="18"/>
+              </w:rPr>
+              <w:t xml:space="preserve">~20\u201329%</w:t>
+            </w:r>
+          </w:p>
+        </w:tc>
+        <w:tc>
+          <w:tcPr>
+            <w:tcW w:type="dxa" w:w="3000"/>
+            <w:tcBorders>
+              <w:top w:val="single" w:color="CCCCCC" w:sz="1"/>
+              <w:left w:val="single" w:color="CCCCCC" w:sz="1"/>
+              <w:bottom w:val="single" w:color="CCCCCC" w:sz="1"/>
+              <w:right w:val="single" w:color="CCCCCC" w:sz="1"/>
+            </w:tcBorders>
+            <w:tcMar>
+              <w:top w:type="dxa" w:w="60"/>
+              <w:left w:type="dxa" w:w="100"/>
+              <w:bottom w:type="dxa" w:w="60"/>
+              <w:right w:type="dxa" w:w="100"/>
+            </w:tcMar>
+          </w:tcPr>
+          <w:p>
+            <w:pPr>
+              <w:spacing w:after="0"/>
+            </w:pPr>
+            <w:r>
+              <w:rPr>
+                <w:rFonts w:ascii="Arial" w:cs="Arial" w:eastAsia="Arial" w:hAnsi="Arial"/>
+                <w:b w:val="false"/>
+                <w:bCs w:val="false"/>
+                <w:sz w:val="18"/>
+                <w:szCs w:val="18"/>
+              </w:rPr>
+              <w:t xml:space="preserve">physiological</w:t>
+            </w:r>
+          </w:p>
+        </w:tc>
+      </w:tr>
+      <w:tr>
+        <w:tc>
+          <w:tcPr>
+            <w:tcW w:type="dxa" w:w="3100"/>
+            <w:tcBorders>
+              <w:top w:val="single" w:color="CCCCCC" w:sz="1"/>
+              <w:left w:val="single" w:color="CCCCCC" w:sz="1"/>
+              <w:bottom w:val="single" w:color="CCCCCC" w:sz="1"/>
+              <w:right w:val="single" w:color="CCCCCC" w:sz="1"/>
+            </w:tcBorders>
+            <w:tcMar>
+              <w:top w:type="dxa" w:w="60"/>
+              <w:left w:type="dxa" w:w="100"/>
+              <w:bottom w:type="dxa" w:w="60"/>
+              <w:right w:type="dxa" w:w="100"/>
+            </w:tcMar>
+          </w:tcPr>
+          <w:p>
+            <w:pPr>
+              <w:spacing w:after="0"/>
+            </w:pPr>
+            <w:r>
+              <w:rPr>
+                <w:rFonts w:ascii="Arial" w:cs="Arial" w:eastAsia="Arial" w:hAnsi="Arial"/>
+                <w:b w:val="false"/>
+                <w:bCs w:val="false"/>
+                <w:sz w:val="18"/>
+                <w:szCs w:val="18"/>
+              </w:rPr>
+              <w:t xml:space="preserve">REM epochs immobile (video)</w:t>
+            </w:r>
+          </w:p>
+        </w:tc>
+        <w:tc>
+          <w:tcPr>
+            <w:tcW w:type="dxa" w:w="2100"/>
+            <w:tcBorders>
+              <w:top w:val="single" w:color="CCCCCC" w:sz="1"/>
+              <w:left w:val="single" w:color="CCCCCC" w:sz="1"/>
+              <w:bottom w:val="single" w:color="CCCCCC" w:sz="1"/>
+              <w:right w:val="single" w:color="CCCCCC" w:sz="1"/>
+            </w:tcBorders>
+            <w:tcMar>
+              <w:top w:type="dxa" w:w="60"/>
+              <w:left w:type="dxa" w:w="100"/>
+              <w:bottom w:type="dxa" w:w="60"/>
+              <w:right w:type="dxa" w:w="100"/>
+            </w:tcMar>
+          </w:tcPr>
+          <w:p>
+            <w:pPr>
+              <w:spacing w:after="0"/>
+            </w:pPr>
+            <w:r>
+              <w:rPr>
+                <w:rFonts w:ascii="Arial" w:cs="Arial" w:eastAsia="Arial" w:hAnsi="Arial"/>
+                <w:b w:val="false"/>
+                <w:bCs w:val="false"/>
+                <w:sz w:val="18"/>
+                <w:szCs w:val="18"/>
+              </w:rPr>
+              <w:t xml:space="preserve">94.8%</w:t>
+            </w:r>
+          </w:p>
+        </w:tc>
+        <w:tc>
+          <w:tcPr>
+            <w:tcW w:type="dxa" w:w="3000"/>
+            <w:tcBorders>
+              <w:top w:val="single" w:color="CCCCCC" w:sz="1"/>
+              <w:left w:val="single" w:color="CCCCCC" w:sz="1"/>
+              <w:bottom w:val="single" w:color="CCCCCC" w:sz="1"/>
+              <w:right w:val="single" w:color="CCCCCC" w:sz="1"/>
+            </w:tcBorders>
+            <w:tcMar>
+              <w:top w:type="dxa" w:w="60"/>
+              <w:left w:type="dxa" w:w="100"/>
+              <w:bottom w:type="dxa" w:w="60"/>
+              <w:right w:type="dxa" w:w="100"/>
+            </w:tcMar>
+          </w:tcPr>
+          <w:p>
+            <w:pPr>
+              <w:spacing w:after="0"/>
+            </w:pPr>
+            <w:r>
+              <w:rPr>
+                <w:rFonts w:ascii="Arial" w:cs="Arial" w:eastAsia="Arial" w:hAnsi="Arial"/>
+                <w:b w:val="false"/>
+                <w:bCs w:val="false"/>
+                <w:sz w:val="18"/>
+                <w:szCs w:val="18"/>
+              </w:rPr>
+              <w:t xml:space="preserve">highest of any state \u2192 not active wake</w:t>
+            </w:r>
+          </w:p>
+        </w:tc>
+      </w:tr>
+      <w:tr>
+        <w:tc>
+          <w:tcPr>
+            <w:tcW w:type="dxa" w:w="3100"/>
+            <w:tcBorders>
+              <w:top w:val="single" w:color="CCCCCC" w:sz="1"/>
+              <w:left w:val="single" w:color="CCCCCC" w:sz="1"/>
+              <w:bottom w:val="single" w:color="CCCCCC" w:sz="1"/>
+              <w:right w:val="single" w:color="CCCCCC" w:sz="1"/>
+            </w:tcBorders>
+            <w:tcMar>
+              <w:top w:type="dxa" w:w="60"/>
+              <w:left w:type="dxa" w:w="100"/>
+              <w:bottom w:type="dxa" w:w="60"/>
+              <w:right w:type="dxa" w:w="100"/>
+            </w:tcMar>
+          </w:tcPr>
+          <w:p>
+            <w:pPr>
+              <w:spacing w:after="0"/>
+            </w:pPr>
+            <w:r>
+              <w:rPr>
+                <w:rFonts w:ascii="Arial" w:cs="Arial" w:eastAsia="Arial" w:hAnsi="Arial"/>
+                <w:b w:val="false"/>
+                <w:bCs w:val="false"/>
+                <w:sz w:val="18"/>
+                <w:szCs w:val="18"/>
+              </w:rPr>
+              <w:t xml:space="preserve">NREM / Wake immobile</w:t>
+            </w:r>
+          </w:p>
+        </w:tc>
+        <w:tc>
+          <w:tcPr>
+            <w:tcW w:type="dxa" w:w="2100"/>
+            <w:tcBorders>
+              <w:top w:val="single" w:color="CCCCCC" w:sz="1"/>
+              <w:left w:val="single" w:color="CCCCCC" w:sz="1"/>
+              <w:bottom w:val="single" w:color="CCCCCC" w:sz="1"/>
+              <w:right w:val="single" w:color="CCCCCC" w:sz="1"/>
+            </w:tcBorders>
+            <w:tcMar>
+              <w:top w:type="dxa" w:w="60"/>
+              <w:left w:type="dxa" w:w="100"/>
+              <w:bottom w:type="dxa" w:w="60"/>
+              <w:right w:type="dxa" w:w="100"/>
+            </w:tcMar>
+          </w:tcPr>
+          <w:p>
+            <w:pPr>
+              <w:spacing w:after="0"/>
+            </w:pPr>
+            <w:r>
+              <w:rPr>
+                <w:rFonts w:ascii="Arial" w:cs="Arial" w:eastAsia="Arial" w:hAnsi="Arial"/>
+                <w:b w:val="false"/>
+                <w:bCs w:val="false"/>
+                <w:sz w:val="18"/>
+                <w:szCs w:val="18"/>
+              </w:rPr>
+              <w:t xml:space="preserve">90% / 89%</w:t>
+            </w:r>
+          </w:p>
+        </w:tc>
+        <w:tc>
+          <w:tcPr>
+            <w:tcW w:type="dxa" w:w="3000"/>
+            <w:tcBorders>
+              <w:top w:val="single" w:color="CCCCCC" w:sz="1"/>
+              <w:left w:val="single" w:color="CCCCCC" w:sz="1"/>
+              <w:bottom w:val="single" w:color="CCCCCC" w:sz="1"/>
+              <w:right w:val="single" w:color="CCCCCC" w:sz="1"/>
+            </w:tcBorders>
+            <w:tcMar>
+              <w:top w:type="dxa" w:w="60"/>
+              <w:left w:type="dxa" w:w="100"/>
+              <w:bottom w:type="dxa" w:w="60"/>
+              <w:right w:type="dxa" w:w="100"/>
+            </w:tcMar>
+          </w:tcPr>
+          <w:p>
+            <w:pPr>
+              <w:spacing w:after="0"/>
+            </w:pPr>
+            <w:r>
+              <w:rPr>
+                <w:rFonts w:ascii="Arial" w:cs="Arial" w:eastAsia="Arial" w:hAnsi="Arial"/>
+                <w:b w:val="false"/>
+                <w:bCs w:val="false"/>
+                <w:sz w:val="18"/>
+                <w:szCs w:val="18"/>
+              </w:rPr>
+              <w:t xml:space="preserve">REM is the most immobile state</w:t>
+            </w:r>
+          </w:p>
+        </w:tc>
+      </w:tr>
+      <w:tr>
+        <w:tc>
+          <w:tcPr>
+            <w:tcW w:type="dxa" w:w="3100"/>
+            <w:tcBorders>
+              <w:top w:val="single" w:color="CCCCCC" w:sz="1"/>
+              <w:left w:val="single" w:color="CCCCCC" w:sz="1"/>
+              <w:bottom w:val="single" w:color="CCCCCC" w:sz="1"/>
+              <w:right w:val="single" w:color="CCCCCC" w:sz="1"/>
+            </w:tcBorders>
+            <w:tcMar>
+              <w:top w:type="dxa" w:w="60"/>
+              <w:left w:type="dxa" w:w="100"/>
+              <w:bottom w:type="dxa" w:w="60"/>
+              <w:right w:type="dxa" w:w="100"/>
+            </w:tcMar>
+          </w:tcPr>
+          <w:p>
+            <w:pPr>
+              <w:spacing w:after="0"/>
+            </w:pPr>
+            <w:r>
+              <w:rPr>
+                <w:rFonts w:ascii="Arial" w:cs="Arial" w:eastAsia="Arial" w:hAnsi="Arial"/>
+                <w:b w:val="false"/>
+                <w:bCs w:val="false"/>
+                <w:sz w:val="18"/>
+                <w:szCs w:val="18"/>
+              </w:rPr>
+              <w:t xml:space="preserve">REM vs wake motion</w:t>
+            </w:r>
+          </w:p>
+        </w:tc>
+        <w:tc>
+          <w:tcPr>
+            <w:tcW w:type="dxa" w:w="2100"/>
+            <w:tcBorders>
+              <w:top w:val="single" w:color="CCCCCC" w:sz="1"/>
+              <w:left w:val="single" w:color="CCCCCC" w:sz="1"/>
+              <w:bottom w:val="single" w:color="CCCCCC" w:sz="1"/>
+              <w:right w:val="single" w:color="CCCCCC" w:sz="1"/>
+            </w:tcBorders>
+            <w:tcMar>
+              <w:top w:type="dxa" w:w="60"/>
+              <w:left w:type="dxa" w:w="100"/>
+              <w:bottom w:type="dxa" w:w="60"/>
+              <w:right w:type="dxa" w:w="100"/>
+            </w:tcMar>
+          </w:tcPr>
+          <w:p>
+            <w:pPr>
+              <w:spacing w:after="0"/>
+            </w:pPr>
+            <w:r>
+              <w:rPr>
+                <w:rFonts w:ascii="Arial" w:cs="Arial" w:eastAsia="Arial" w:hAnsi="Arial"/>
+                <w:b w:val="false"/>
+                <w:bCs w:val="false"/>
+                <w:sz w:val="18"/>
+                <w:szCs w:val="18"/>
+              </w:rPr>
+              <w:t xml:space="preserve">d = \u22120.27, p &lt; 0.001</w:t>
+            </w:r>
+          </w:p>
+        </w:tc>
+        <w:tc>
+          <w:tcPr>
+            <w:tcW w:type="dxa" w:w="3000"/>
+            <w:tcBorders>
+              <w:top w:val="single" w:color="CCCCCC" w:sz="1"/>
+              <w:left w:val="single" w:color="CCCCCC" w:sz="1"/>
+              <w:bottom w:val="single" w:color="CCCCCC" w:sz="1"/>
+              <w:right w:val="single" w:color="CCCCCC" w:sz="1"/>
+            </w:tcBorders>
+            <w:tcMar>
+              <w:top w:type="dxa" w:w="60"/>
+              <w:left w:type="dxa" w:w="100"/>
+              <w:bottom w:type="dxa" w:w="60"/>
+              <w:right w:type="dxa" w:w="100"/>
+            </w:tcMar>
+          </w:tcPr>
+          <w:p>
+            <w:pPr>
+              <w:spacing w:after="0"/>
+            </w:pPr>
+            <w:r>
+              <w:rPr>
+                <w:rFonts w:ascii="Arial" w:cs="Arial" w:eastAsia="Arial" w:hAnsi="Arial"/>
+                <w:b w:val="false"/>
+                <w:bCs w:val="false"/>
+                <w:sz w:val="18"/>
+                <w:szCs w:val="18"/>
+              </w:rPr>
+              <w:t xml:space="preserve">REM significantly less mobile than wake</w:t>
+            </w:r>
+          </w:p>
+        </w:tc>
+      </w:tr>
+      <w:tr>
+        <w:tc>
+          <w:tcPr>
+            <w:tcW w:type="dxa" w:w="3100"/>
+            <w:tcBorders>
+              <w:top w:val="single" w:color="CCCCCC" w:sz="1"/>
+              <w:left w:val="single" w:color="CCCCCC" w:sz="1"/>
+              <w:bottom w:val="single" w:color="CCCCCC" w:sz="1"/>
+              <w:right w:val="single" w:color="CCCCCC" w:sz="1"/>
+            </w:tcBorders>
+            <w:tcMar>
+              <w:top w:type="dxa" w:w="60"/>
+              <w:left w:type="dxa" w:w="100"/>
+              <w:bottom w:type="dxa" w:w="60"/>
+              <w:right w:type="dxa" w:w="100"/>
+            </w:tcMar>
+          </w:tcPr>
+          <w:p>
+            <w:pPr>
+              <w:spacing w:after="0"/>
+            </w:pPr>
+            <w:r>
+              <w:rPr>
+                <w:rFonts w:ascii="Arial" w:cs="Arial" w:eastAsia="Arial" w:hAnsi="Arial"/>
+                <w:b w:val="false"/>
+                <w:bCs w:val="false"/>
+                <w:sz w:val="18"/>
+                <w:szCs w:val="18"/>
+              </w:rPr>
+              <w:t xml:space="preserve">Wake\u2192REM transition prob.</w:t>
+            </w:r>
+          </w:p>
+        </w:tc>
+        <w:tc>
+          <w:tcPr>
+            <w:tcW w:type="dxa" w:w="2100"/>
+            <w:tcBorders>
+              <w:top w:val="single" w:color="CCCCCC" w:sz="1"/>
+              <w:left w:val="single" w:color="CCCCCC" w:sz="1"/>
+              <w:bottom w:val="single" w:color="CCCCCC" w:sz="1"/>
+              <w:right w:val="single" w:color="CCCCCC" w:sz="1"/>
+            </w:tcBorders>
+            <w:tcMar>
+              <w:top w:type="dxa" w:w="60"/>
+              <w:left w:type="dxa" w:w="100"/>
+              <w:bottom w:type="dxa" w:w="60"/>
+              <w:right w:type="dxa" w:w="100"/>
+            </w:tcMar>
+          </w:tcPr>
+          <w:p>
+            <w:pPr>
+              <w:spacing w:after="0"/>
+            </w:pPr>
+            <w:r>
+              <w:rPr>
+                <w:rFonts w:ascii="Arial" w:cs="Arial" w:eastAsia="Arial" w:hAnsi="Arial"/>
+                <w:b w:val="false"/>
+                <w:bCs w:val="false"/>
+                <w:sz w:val="18"/>
+                <w:szCs w:val="18"/>
+              </w:rPr>
+              <w:t xml:space="preserve">0.07</w:t>
+            </w:r>
+          </w:p>
+        </w:tc>
+        <w:tc>
+          <w:tcPr>
+            <w:tcW w:type="dxa" w:w="3000"/>
+            <w:tcBorders>
+              <w:top w:val="single" w:color="CCCCCC" w:sz="1"/>
+              <w:left w:val="single" w:color="CCCCCC" w:sz="1"/>
+              <w:bottom w:val="single" w:color="CCCCCC" w:sz="1"/>
+              <w:right w:val="single" w:color="CCCCCC" w:sz="1"/>
+            </w:tcBorders>
+            <w:tcMar>
+              <w:top w:type="dxa" w:w="60"/>
+              <w:left w:type="dxa" w:w="100"/>
+              <w:bottom w:type="dxa" w:w="60"/>
+              <w:right w:type="dxa" w:w="100"/>
+            </w:tcMar>
+          </w:tcPr>
+          <w:p>
+            <w:pPr>
+              <w:spacing w:after="0"/>
+            </w:pPr>
+            <w:r>
+              <w:rPr>
+                <w:rFonts w:ascii="Arial" w:cs="Arial" w:eastAsia="Arial" w:hAnsi="Arial"/>
+                <w:b w:val="false"/>
+                <w:bCs w:val="false"/>
+                <w:sz w:val="18"/>
+                <w:szCs w:val="18"/>
+              </w:rPr>
+              <w:t xml:space="preserve">low; REM rarely entered from wake</w:t>
+            </w:r>
+          </w:p>
+        </w:tc>
+      </w:tr>
+      <w:tr>
+        <w:tc>
+          <w:tcPr>
+            <w:tcW w:type="dxa" w:w="3100"/>
+            <w:tcBorders>
+              <w:top w:val="single" w:color="CCCCCC" w:sz="1"/>
+              <w:left w:val="single" w:color="CCCCCC" w:sz="1"/>
+              <w:bottom w:val="single" w:color="CCCCCC" w:sz="1"/>
+              <w:right w:val="single" w:color="CCCCCC" w:sz="1"/>
+            </w:tcBorders>
+            <w:tcMar>
+              <w:top w:type="dxa" w:w="60"/>
+              <w:left w:type="dxa" w:w="100"/>
+              <w:bottom w:type="dxa" w:w="60"/>
+              <w:right w:type="dxa" w:w="100"/>
+            </w:tcMar>
+          </w:tcPr>
+          <w:p>
+            <w:pPr>
+              <w:spacing w:after="0"/>
+            </w:pPr>
+            <w:r>
+              <w:rPr>
+                <w:rFonts w:ascii="Arial" w:cs="Arial" w:eastAsia="Arial" w:hAnsi="Arial"/>
+                <w:b w:val="false"/>
+                <w:bCs w:val="false"/>
+                <w:sz w:val="18"/>
+                <w:szCs w:val="18"/>
+              </w:rPr>
+              <w:t xml:space="preserve">REM self-maintenance prob.</w:t>
+            </w:r>
+          </w:p>
+        </w:tc>
+        <w:tc>
+          <w:tcPr>
+            <w:tcW w:type="dxa" w:w="2100"/>
+            <w:tcBorders>
+              <w:top w:val="single" w:color="CCCCCC" w:sz="1"/>
+              <w:left w:val="single" w:color="CCCCCC" w:sz="1"/>
+              <w:bottom w:val="single" w:color="CCCCCC" w:sz="1"/>
+              <w:right w:val="single" w:color="CCCCCC" w:sz="1"/>
+            </w:tcBorders>
+            <w:tcMar>
+              <w:top w:type="dxa" w:w="60"/>
+              <w:left w:type="dxa" w:w="100"/>
+              <w:bottom w:type="dxa" w:w="60"/>
+              <w:right w:type="dxa" w:w="100"/>
+            </w:tcMar>
+          </w:tcPr>
+          <w:p>
+            <w:pPr>
+              <w:spacing w:after="0"/>
+            </w:pPr>
+            <w:r>
+              <w:rPr>
+                <w:rFonts w:ascii="Arial" w:cs="Arial" w:eastAsia="Arial" w:hAnsi="Arial"/>
+                <w:b w:val="false"/>
+                <w:bCs w:val="false"/>
+                <w:sz w:val="18"/>
+                <w:szCs w:val="18"/>
+              </w:rPr>
+              <w:t xml:space="preserve">0.23</w:t>
+            </w:r>
+          </w:p>
+        </w:tc>
+        <w:tc>
+          <w:tcPr>
+            <w:tcW w:type="dxa" w:w="3000"/>
+            <w:tcBorders>
+              <w:top w:val="single" w:color="CCCCCC" w:sz="1"/>
+              <w:left w:val="single" w:color="CCCCCC" w:sz="1"/>
+              <w:bottom w:val="single" w:color="CCCCCC" w:sz="1"/>
+              <w:right w:val="single" w:color="CCCCCC" w:sz="1"/>
+            </w:tcBorders>
+            <w:tcMar>
+              <w:top w:type="dxa" w:w="60"/>
+              <w:left w:type="dxa" w:w="100"/>
+              <w:bottom w:type="dxa" w:w="60"/>
+              <w:right w:type="dxa" w:w="100"/>
+            </w:tcMar>
+          </w:tcPr>
+          <w:p>
+            <w:pPr>
+              <w:spacing w:after="0"/>
+            </w:pPr>
+            <w:r>
+              <w:rPr>
+                <w:rFonts w:ascii="Arial" w:cs="Arial" w:eastAsia="Arial" w:hAnsi="Arial"/>
+                <w:b w:val="false"/>
+                <w:bCs w:val="false"/>
+                <w:sz w:val="18"/>
+                <w:szCs w:val="18"/>
+              </w:rPr>
+              <w:t xml:space="preserve">physiological REM persistence</w:t>
+            </w:r>
+          </w:p>
+        </w:tc>
+      </w:tr>
+      <w:tr>
+        <w:tc>
+          <w:tcPr>
+            <w:tcW w:type="dxa" w:w="3100"/>
+            <w:tcBorders>
+              <w:top w:val="single" w:color="CCCCCC" w:sz="1"/>
+              <w:left w:val="single" w:color="CCCCCC" w:sz="1"/>
+              <w:bottom w:val="single" w:color="CCCCCC" w:sz="1"/>
+              <w:right w:val="single" w:color="CCCCCC" w:sz="1"/>
+            </w:tcBorders>
+            <w:tcMar>
+              <w:top w:type="dxa" w:w="60"/>
+              <w:left w:type="dxa" w:w="100"/>
+              <w:bottom w:type="dxa" w:w="60"/>
+              <w:right w:type="dxa" w:w="100"/>
+            </w:tcMar>
+          </w:tcPr>
+          <w:p>
+            <w:pPr>
+              <w:spacing w:after="0"/>
+            </w:pPr>
+            <w:r>
+              <w:rPr>
+                <w:rFonts w:ascii="Arial" w:cs="Arial" w:eastAsia="Arial" w:hAnsi="Arial"/>
+                <w:b w:val="false"/>
+                <w:bCs w:val="false"/>
+                <w:sz w:val="18"/>
+                <w:szCs w:val="18"/>
+              </w:rPr>
+              <w:t xml:space="preserve">CA3 theta peak (REM)</w:t>
+            </w:r>
+          </w:p>
+        </w:tc>
+        <w:tc>
+          <w:tcPr>
+            <w:tcW w:type="dxa" w:w="2100"/>
+            <w:tcBorders>
+              <w:top w:val="single" w:color="CCCCCC" w:sz="1"/>
+              <w:left w:val="single" w:color="CCCCCC" w:sz="1"/>
+              <w:bottom w:val="single" w:color="CCCCCC" w:sz="1"/>
+              <w:right w:val="single" w:color="CCCCCC" w:sz="1"/>
+            </w:tcBorders>
+            <w:tcMar>
+              <w:top w:type="dxa" w:w="60"/>
+              <w:left w:type="dxa" w:w="100"/>
+              <w:bottom w:type="dxa" w:w="60"/>
+              <w:right w:type="dxa" w:w="100"/>
+            </w:tcMar>
+          </w:tcPr>
+          <w:p>
+            <w:pPr>
+              <w:spacing w:after="0"/>
+            </w:pPr>
+            <w:r>
+              <w:rPr>
+                <w:rFonts w:ascii="Arial" w:cs="Arial" w:eastAsia="Arial" w:hAnsi="Arial"/>
+                <w:b w:val="false"/>
+                <w:bCs w:val="false"/>
+                <w:sz w:val="18"/>
+                <w:szCs w:val="18"/>
+              </w:rPr>
+              <w:t xml:space="preserve">~6.5 Hz</w:t>
+            </w:r>
+          </w:p>
+        </w:tc>
+        <w:tc>
+          <w:tcPr>
+            <w:tcW w:type="dxa" w:w="3000"/>
+            <w:tcBorders>
+              <w:top w:val="single" w:color="CCCCCC" w:sz="1"/>
+              <w:left w:val="single" w:color="CCCCCC" w:sz="1"/>
+              <w:bottom w:val="single" w:color="CCCCCC" w:sz="1"/>
+              <w:right w:val="single" w:color="CCCCCC" w:sz="1"/>
+            </w:tcBorders>
+            <w:tcMar>
+              <w:top w:type="dxa" w:w="60"/>
+              <w:left w:type="dxa" w:w="100"/>
+              <w:bottom w:type="dxa" w:w="60"/>
+              <w:right w:type="dxa" w:w="100"/>
+            </w:tcMar>
+          </w:tcPr>
+          <w:p>
+            <w:pPr>
+              <w:spacing w:after="0"/>
+            </w:pPr>
+            <w:r>
+              <w:rPr>
+                <w:rFonts w:ascii="Arial" w:cs="Arial" w:eastAsia="Arial" w:hAnsi="Arial"/>
+                <w:b w:val="false"/>
+                <w:bCs w:val="false"/>
+                <w:sz w:val="18"/>
+                <w:szCs w:val="18"/>
+              </w:rPr>
+              <w:t xml:space="preserve">canonical rodent REM theta</w:t>
+            </w:r>
+          </w:p>
+        </w:tc>
+      </w:tr>
+      <w:tr>
+        <w:tc>
+          <w:tcPr>
+            <w:tcW w:type="dxa" w:w="3100"/>
+            <w:tcBorders>
+              <w:top w:val="single" w:color="CCCCCC" w:sz="1"/>
+              <w:left w:val="single" w:color="CCCCCC" w:sz="1"/>
+              <w:bottom w:val="single" w:color="CCCCCC" w:sz="1"/>
+              <w:right w:val="single" w:color="CCCCCC" w:sz="1"/>
+            </w:tcBorders>
+            <w:tcMar>
+              <w:top w:type="dxa" w:w="60"/>
+              <w:left w:type="dxa" w:w="100"/>
+              <w:bottom w:type="dxa" w:w="60"/>
+              <w:right w:type="dxa" w:w="100"/>
+            </w:tcMar>
+          </w:tcPr>
+          <w:p>
+            <w:pPr>
+              <w:spacing w:after="0"/>
+            </w:pPr>
+            <w:r>
+              <w:rPr>
+                <w:rFonts w:ascii="Arial" w:cs="Arial" w:eastAsia="Arial" w:hAnsi="Arial"/>
+                <w:b w:val="false"/>
+                <w:bCs w:val="false"/>
+                <w:sz w:val="18"/>
+                <w:szCs w:val="18"/>
+              </w:rPr>
+              <w:t xml:space="preserve">CA3 theta/delta, REM vs wake</w:t>
+            </w:r>
+          </w:p>
+        </w:tc>
+        <w:tc>
+          <w:tcPr>
+            <w:tcW w:type="dxa" w:w="2100"/>
+            <w:tcBorders>
+              <w:top w:val="single" w:color="CCCCCC" w:sz="1"/>
+              <w:left w:val="single" w:color="CCCCCC" w:sz="1"/>
+              <w:bottom w:val="single" w:color="CCCCCC" w:sz="1"/>
+              <w:right w:val="single" w:color="CCCCCC" w:sz="1"/>
+            </w:tcBorders>
+            <w:tcMar>
+              <w:top w:type="dxa" w:w="60"/>
+              <w:left w:type="dxa" w:w="100"/>
+              <w:bottom w:type="dxa" w:w="60"/>
+              <w:right w:type="dxa" w:w="100"/>
+            </w:tcMar>
+          </w:tcPr>
+          <w:p>
+            <w:pPr>
+              <w:spacing w:after="0"/>
+            </w:pPr>
+            <w:r>
+              <w:rPr>
+                <w:rFonts w:ascii="Arial" w:cs="Arial" w:eastAsia="Arial" w:hAnsi="Arial"/>
+                <w:b w:val="false"/>
+                <w:bCs w:val="false"/>
+                <w:sz w:val="18"/>
+                <w:szCs w:val="18"/>
+              </w:rPr>
+              <w:t xml:space="preserve">d = +0.36</w:t>
+            </w:r>
+          </w:p>
+        </w:tc>
+        <w:tc>
+          <w:tcPr>
+            <w:tcW w:type="dxa" w:w="3000"/>
+            <w:tcBorders>
+              <w:top w:val="single" w:color="CCCCCC" w:sz="1"/>
+              <w:left w:val="single" w:color="CCCCCC" w:sz="1"/>
+              <w:bottom w:val="single" w:color="CCCCCC" w:sz="1"/>
+              <w:right w:val="single" w:color="CCCCCC" w:sz="1"/>
+            </w:tcBorders>
+            <w:tcMar>
+              <w:top w:type="dxa" w:w="60"/>
+              <w:left w:type="dxa" w:w="100"/>
+              <w:bottom w:type="dxa" w:w="60"/>
+              <w:right w:type="dxa" w:w="100"/>
+            </w:tcMar>
+          </w:tcPr>
+          <w:p>
+            <w:pPr>
+              <w:spacing w:after="0"/>
+            </w:pPr>
+            <w:r>
+              <w:rPr>
+                <w:rFonts w:ascii="Arial" w:cs="Arial" w:eastAsia="Arial" w:hAnsi="Arial"/>
+                <w:b w:val="false"/>
+                <w:bCs w:val="false"/>
+                <w:sz w:val="18"/>
+                <w:szCs w:val="18"/>
+              </w:rPr>
+              <w:t xml:space="preserve">hippocampal theta greatest in REM</w:t>
+            </w:r>
+          </w:p>
+        </w:tc>
+      </w:tr>
+    </w:tbl>
+    <w:p>
+      <w:pPr>
+        <w:spacing w:after="160" w:line="276"/>
+      </w:pPr>
+      <w:r>
+        <w:t xml:space="preserve">Per-epoch video motion energy and hippocampal signatures for the validation subset (knockout and wild-type at 3, 9, and 12 months). REM epochs classified from EEG were behaviourally immobile at physiological frequency, were rarely entered from wakefulness, and carried canonical hippocampal theta, indicating that the EEG-defined REM state is not misclassified active wakefulness. Because mean wake motion is diluted by quiet rest, the genotype-blind contrast with active (high-movement) wake is reported in Fig. S7. [Values to be updated from the full-cohort run.]</w:t>
+      </w:r>
+    </w:p>
+    <w:p>
+      <w:pPr>
         <w:shd w:fill="FFF2CC" w:val="clear"/>
         <w:spacing w:after="160" w:line="276"/>
       </w:pPr>
@@ -13130,6 +14162,34 @@
       </w:r>
       <w:r>
         <w:t xml:space="preserve">Genotype effect size for each headline REM feature across the 9-point threshold grid (top): the 4-month beta and theta/delta effects remain positive and the 12-month beta effect remains negative throughout, showing the findings are not artifacts of any single staging cutoff. The theta-delta-plane state-separation diagnostic (bottom) provides visual justification for the band-power vigilance-state classification.</w:t>
+      </w:r>
+    </w:p>
+    <w:p>
+      <w:pPr>
+        <w:spacing w:after="80"/>
+      </w:pPr>
+      <w:r>
+        <w:rPr>
+          <w:i/>
+          <w:iCs/>
+          <w:color w:val="AA0000"/>
+        </w:rPr>
+        <w:t xml:space="preserve">[missing figure: sleep_state_validation_motion.png]</w:t>
+      </w:r>
+    </w:p>
+    <w:p>
+      <w:pPr>
+        <w:spacing w:after="160" w:line="276"/>
+      </w:pPr>
+      <w:r>
+        <w:rPr>
+          <w:b/>
+          <w:bCs/>
+        </w:rPr>
+        <w:t xml:space="preserve">Figure S7. Validation of EEG-defined REM using synchronous video. </w:t>
+      </w:r>
+      <w:r>
+        <w:t xml:space="preserve">Left: video motion energy (an electromyography surrogate) by vigilance state; REM-classified epochs are as immobile as NREM and below active wakefulness, with 94.8% of REM epochs behaviourally immobile. Right: per-epoch hippocampal CA3 theta/delta against cortical delta/theta ratio, coloured by motion energy; the REM cluster shows high CA3 theta and low movement. Together with physiological REM proportion, low wake-to-REM transition probability, and a ~6.5 Hz CA3 theta peak, these confirm that the EEG-defined REM state is behaviourally quiescent and hippocampally appropriate rather than misclassified active wake.</w:t>
       </w:r>
     </w:p>
     <w:sectPr>

</xml_diff>